<commit_message>
constitution: merge parallel drafts into v0.4
Base v0.3 (handover-docs consolidation) + merged from the parallel
v0.2: Article 13 (Governance within the University - Student Teams
Procedure Ver 2, MSTI reporting/funding cycle, ITTA), Procedure
overlays on recruitment/leadership/onboarding/misconduct, CPD +
ENG4802 (6.5), MNET Schedule norms (4.5), funding figures + Reftab
(11.2-11.3), 2025 EOY stakeholder record (10.6). Amendments
renumbered to Article 14. v0.2 copy retired (fully merged; in
history at c798d6c).

Co-Authored-By: Claude Fable 5 <noreply@anthropic.com>
</commit_message>
<xml_diff>
--- a/docs/constitution/MNET-Constitution-DRAFT.docx
+++ b/docs/constitution/MNET-Constitution-DRAFT.docx
@@ -4,7 +4,7 @@
   <w:body>
     <w:p>
       <w:pPr>
-        <w:spacing w:before="2400"/>
+        <w:spacing w:after="0" w:before="2200"/>
         <w:jc w:val="center"/>
       </w:pPr>
       <w:r>
@@ -19,6 +19,7 @@
     </w:p>
     <w:p>
       <w:pPr>
+        <w:spacing w:after="240"/>
         <w:jc w:val="center"/>
       </w:pPr>
       <w:r>
@@ -33,14 +34,13 @@
     </w:p>
     <w:p>
       <w:pPr>
-        <w:spacing w:before="240"/>
+        <w:spacing w:after="480"/>
         <w:jc w:val="center"/>
       </w:pPr>
       <w:r>
         <w:rPr>
           <w:b/>
           <w:bCs/>
-          <w:color w:val="DC003B"/>
           <w:sz w:val="44"/>
           <w:szCs w:val="44"/>
         </w:rPr>
@@ -49,48 +49,43 @@
     </w:p>
     <w:p>
       <w:pPr>
-        <w:spacing w:before="360"/>
+        <w:spacing w:after="240"/>
         <w:jc w:val="center"/>
       </w:pPr>
       <w:r>
         <w:rPr>
           <w:b/>
           <w:bCs/>
-          <w:sz w:val="26"/>
-          <w:szCs w:val="26"/>
-        </w:rPr>
-        <w:t xml:space="preserve">DRAFT v0.3 — 10 July 2026</w:t>
-      </w:r>
-    </w:p>
-    <w:p>
-      <w:pPr>
-        <w:spacing w:before="120"/>
+          <w:sz w:val="28"/>
+          <w:szCs w:val="28"/>
+        </w:rPr>
+        <w:t xml:space="preserve">DRAFT v0.4 — 10 July 2026</w:t>
+      </w:r>
+    </w:p>
+    <w:p>
+      <w:pPr>
+        <w:spacing w:after="120"/>
         <w:jc w:val="center"/>
       </w:pPr>
       <w:r>
         <w:rPr>
           <w:i/>
           <w:iCs/>
-          <w:color w:val="6B6B6B"/>
-          <w:sz w:val="20"/>
-          <w:szCs w:val="20"/>
-        </w:rPr>
-        <w:t xml:space="preserve">Consolidates the team’s working DRAFT MNET Constitution (Google Docs) with the policies recorded in the Team Lead Handover [2023–5], the MNET General Handover, the Operations Handover, and the 2025 Prospectus. Prepared for review by the MNET Leadership Team; not yet ratified.</w:t>
-      </w:r>
-    </w:p>
-    <w:p>
-      <w:pPr>
-        <w:spacing w:before="160"/>
+        </w:rPr>
+        <w:t xml:space="preserve">Consolidates the team’s working DRAFT MNET Constitution (Google Docs) with the policies recorded in the Team Lead Handover [2023–5], the MNET General Handover, the Operations Handover, the 2025 Prospectus, and the Monash Student Teams Procedure (Ver 2). Prepared for review by the MNET Leadership Team; not yet ratified.</w:t>
+      </w:r>
+    </w:p>
+    <w:p>
+      <w:pPr>
+        <w:spacing w:after="0"/>
         <w:jc w:val="center"/>
       </w:pPr>
       <w:r>
         <w:rPr>
           <w:i/>
           <w:iCs/>
-          <w:sz w:val="22"/>
-          <w:szCs w:val="22"/>
-        </w:rPr>
-        <w:t xml:space="preserve">“Enter the Digital Frontier” · “Access, Upskill, Engage” · “Expanding all horizons.”</w:t>
+        </w:rPr>
+        <w:t xml:space="preserve">"Enter the Digital Frontier" · "Access, Upskill, Engage" · "Expanding all horizons."</w:t>
       </w:r>
     </w:p>
     <w:p>
@@ -100,21 +95,27 @@
     </w:p>
     <w:p>
       <w:pPr>
-        <w:pStyle w:val="Heading1"/>
-      </w:pPr>
-      <w:r>
+        <w:spacing w:after="200"/>
+      </w:pPr>
+      <w:r>
+        <w:rPr>
+          <w:b/>
+          <w:bCs/>
+          <w:sz w:val="32"/>
+          <w:szCs w:val="32"/>
+        </w:rPr>
         <w:t xml:space="preserve">Contents</w:t>
       </w:r>
     </w:p>
     <w:sdt>
       <w:sdtPr>
-        <w:alias w:val="Table of Contents"/>
+        <w:alias w:val="Contents"/>
       </w:sdtPr>
       <w:sdtContent>
         <w:p>
           <w:r>
             <w:fldChar w:fldCharType="begin" w:dirty="true"/>
-            <w:instrText xml:space="preserve">TOC \h \o "1-2"</w:instrText>
+            <w:instrText xml:space="preserve">TOC \h \o "1-1"</w:instrText>
             <w:fldChar w:fldCharType="separate"/>
           </w:r>
         </w:p>
@@ -133,8 +134,13 @@
     <w:p>
       <w:pPr>
         <w:pStyle w:val="Heading1"/>
-      </w:pPr>
-      <w:r>
+        <w:spacing w:after="160" w:before="360"/>
+      </w:pPr>
+      <w:r>
+        <w:rPr>
+          <w:b/>
+          <w:bCs/>
+        </w:rPr>
         <w:t xml:space="preserve">Preamble</w:t>
       </w:r>
     </w:p>
@@ -143,7 +149,7 @@
         <w:spacing w:after="120"/>
       </w:pPr>
       <w:r>
-        <w:t xml:space="preserve">Monash Nexus for Emerging Technologies (MNET) is a student team under the Monash Student Team Initiative (MSTI). Everything the team does falls under the umbrella of simulation technologies — for example XR and immersive media, digital twins, and quantum computing — and “emerging” is read as technologies emerging from the digital realm into the physical: enter the digital frontier. The team is deliberately broad; robotics and other up-and-coming technologies are not out of bounds.</w:t>
+        <w:t xml:space="preserve">Monash Nexus for Emerging Technologies (MNET) is a student team under the Monash Student Team Initiative (MSTI). Everything the team does falls under the umbrella of simulation technologies — for example XR and immersive media, digital twins, and quantum computing — and "emerging" is read as technologies emerging from the digital realm into the physical: enter the digital frontier. The team is deliberately broad; robotics and other up-and-coming technologies are not out of bounds.</w:t>
       </w:r>
     </w:p>
     <w:p>
@@ -159,7 +165,7 @@
         <w:spacing w:after="120"/>
       </w:pPr>
       <w:r>
-        <w:t xml:space="preserve">MNET’s core philosophical values are innovation, collaboration, and excellence (“ICE”). We seek to embody these values through our technical, design, and operational initiatives.</w:t>
+        <w:t xml:space="preserve">MNET’s core philosophical values are innovation, collaboration, and excellence ("ICE"). We seek to embody these values through our technical, design, and operational initiatives.</w:t>
       </w:r>
     </w:p>
     <w:p>
@@ -172,15 +178,12 @@
     </w:p>
     <w:p>
       <w:pPr>
-        <w:spacing w:after="160"/>
+        <w:spacing w:after="120"/>
       </w:pPr>
       <w:r>
         <w:rPr>
           <w:i/>
           <w:iCs/>
-          <w:color w:val="6B6B6B"/>
-          <w:sz w:val="18"/>
-          <w:szCs w:val="18"/>
         </w:rPr>
         <w:t xml:space="preserve">Source: DRAFT MNET Constitution (team working document), Preamble — near verbatim.</w:t>
       </w:r>
@@ -188,8 +191,13 @@
     <w:p>
       <w:pPr>
         <w:pStyle w:val="Heading1"/>
-      </w:pPr>
-      <w:r>
+        <w:spacing w:after="160" w:before="360"/>
+      </w:pPr>
+      <w:r>
+        <w:rPr>
+          <w:b/>
+          <w:bCs/>
+        </w:rPr>
         <w:t xml:space="preserve">Article 1 — Name, Identity and Heritage</w:t>
       </w:r>
     </w:p>
@@ -281,14 +289,19 @@
         <w:spacing w:after="80"/>
       </w:pPr>
       <w:r>
-        <w:t xml:space="preserve">The team mascot is Mepo the platypus, adopted in 2025 and named by a team-wide vote (the “MNET Naming Ceremonial Form”) held on 15 July 2025, the day founder Rohan Kalanje stepped down as team lead. The name carries one letter from each department: Marketing, Education, Projects, Operations.</w:t>
+        <w:t xml:space="preserve">The team mascot is Mepo the platypus, adopted in 2025 and named by a team-wide vote (the "MNET Naming Ceremonial Form") held on 15 July 2025, the day founder Rohan Kalanje stepped down as team lead. The name carries one letter from each department: Marketing, Education, Projects, Operations.</w:t>
       </w:r>
     </w:p>
     <w:p>
       <w:pPr>
         <w:pStyle w:val="Heading1"/>
-      </w:pPr>
-      <w:r>
+        <w:spacing w:after="160" w:before="360"/>
+      </w:pPr>
+      <w:r>
+        <w:rPr>
+          <w:b/>
+          <w:bCs/>
+        </w:rPr>
         <w:t xml:space="preserve">Article 2 — Mission and Objectives</w:t>
       </w:r>
     </w:p>
@@ -297,14 +310,19 @@
         <w:spacing w:after="120"/>
       </w:pPr>
       <w:r>
-        <w:t xml:space="preserve">MNET exists to expose students to the possibilities offered by simulation technologies — XR, quantum computing, and more. As a “nexus”, it offers passionate and talented students the opportunity to collaborate with research labs, work in an industry environment, and get their hands on otherwise inaccessible technology — reshaping “what can’t be” into “what will be”.</w:t>
+        <w:t xml:space="preserve">MNET exists to expose students to the possibilities offered by simulation technologies — XR, quantum computing, and more. As a "nexus", it offers passionate and talented students the opportunity to collaborate with research labs, work in an industry environment, and get their hands on otherwise inaccessible technology — reshaping "what can’t be" into "what will be".</w:t>
       </w:r>
     </w:p>
     <w:p>
       <w:pPr>
         <w:pStyle w:val="Heading2"/>
-      </w:pPr>
-      <w:r>
+        <w:spacing w:after="120" w:before="240"/>
+      </w:pPr>
+      <w:r>
+        <w:rPr>
+          <w:b/>
+          <w:bCs/>
+        </w:rPr>
         <w:t xml:space="preserve">2.1 Objectives</w:t>
       </w:r>
     </w:p>
@@ -388,24 +406,26 @@
     </w:p>
     <w:p>
       <w:pPr>
-        <w:spacing w:after="160"/>
+        <w:spacing w:after="120"/>
       </w:pPr>
       <w:r>
         <w:rPr>
           <w:i/>
           <w:iCs/>
-          <w:color w:val="6B6B6B"/>
-          <w:sz w:val="18"/>
-          <w:szCs w:val="18"/>
-        </w:rPr>
-        <w:t xml:space="preserve">Sources: 2025 Prospectus (“What is MNET”, “Our Impact”); 2026 planning boards.</w:t>
+        </w:rPr>
+        <w:t xml:space="preserve">Sources: 2025 Prospectus ("What is MNET", "Our Impact"); 2026 planning boards.</w:t>
       </w:r>
     </w:p>
     <w:p>
       <w:pPr>
         <w:pStyle w:val="Heading1"/>
-      </w:pPr>
-      <w:r>
+        <w:spacing w:after="160" w:before="360"/>
+      </w:pPr>
+      <w:r>
+        <w:rPr>
+          <w:b/>
+          <w:bCs/>
+        </w:rPr>
         <w:t xml:space="preserve">Article 3 — Code of Conduct</w:t>
       </w:r>
     </w:p>
@@ -419,9 +439,22 @@
     </w:p>
     <w:p>
       <w:pPr>
+        <w:spacing w:after="120"/>
+      </w:pPr>
+      <w:r>
+        <w:t xml:space="preserve">This code adds to — and never replaces — the Monash Student Code of Conduct and the conduct provisions of the Monash Student Teams Procedure (see Article 13); under the Procedure, teams may not create standalone codes of conduct that conflict with university policy.</w:t>
+      </w:r>
+    </w:p>
+    <w:p>
+      <w:pPr>
         <w:pStyle w:val="Heading2"/>
-      </w:pPr>
-      <w:r>
+        <w:spacing w:after="120" w:before="240"/>
+      </w:pPr>
+      <w:r>
+        <w:rPr>
+          <w:b/>
+          <w:bCs/>
+        </w:rPr>
         <w:t xml:space="preserve">3.1 Honesty and Integrity</w:t>
       </w:r>
     </w:p>
@@ -454,8 +487,13 @@
     <w:p>
       <w:pPr>
         <w:pStyle w:val="Heading2"/>
-      </w:pPr>
-      <w:r>
+        <w:spacing w:after="120" w:before="240"/>
+      </w:pPr>
+      <w:r>
+        <w:rPr>
+          <w:b/>
+          <w:bCs/>
+        </w:rPr>
         <w:t xml:space="preserve">3.2 Accountability</w:t>
       </w:r>
     </w:p>
@@ -475,8 +513,13 @@
     <w:p>
       <w:pPr>
         <w:pStyle w:val="Heading2"/>
-      </w:pPr>
-      <w:r>
+        <w:spacing w:after="120" w:before="240"/>
+      </w:pPr>
+      <w:r>
+        <w:rPr>
+          <w:b/>
+          <w:bCs/>
+        </w:rPr>
         <w:t xml:space="preserve">3.3 Fostering Inclusivity</w:t>
       </w:r>
     </w:p>
@@ -509,8 +552,13 @@
     <w:p>
       <w:pPr>
         <w:pStyle w:val="Heading2"/>
-      </w:pPr>
-      <w:r>
+        <w:spacing w:after="120" w:before="240"/>
+      </w:pPr>
+      <w:r>
+        <w:rPr>
+          <w:b/>
+          <w:bCs/>
+        </w:rPr>
         <w:t xml:space="preserve">3.4 Academic Integrity</w:t>
       </w:r>
     </w:p>
@@ -556,8 +604,13 @@
     <w:p>
       <w:pPr>
         <w:pStyle w:val="Heading2"/>
-      </w:pPr>
-      <w:r>
+        <w:spacing w:after="120" w:before="240"/>
+      </w:pPr>
+      <w:r>
+        <w:rPr>
+          <w:b/>
+          <w:bCs/>
+        </w:rPr>
         <w:t xml:space="preserve">3.5 Collaboration</w:t>
       </w:r>
     </w:p>
@@ -590,8 +643,13 @@
     <w:p>
       <w:pPr>
         <w:pStyle w:val="Heading2"/>
-      </w:pPr>
-      <w:r>
+        <w:spacing w:after="120" w:before="240"/>
+      </w:pPr>
+      <w:r>
+        <w:rPr>
+          <w:b/>
+          <w:bCs/>
+        </w:rPr>
         <w:t xml:space="preserve">3.6 Ethics</w:t>
       </w:r>
     </w:p>
@@ -623,15 +681,12 @@
     </w:p>
     <w:p>
       <w:pPr>
-        <w:spacing w:after="160"/>
+        <w:spacing w:after="120"/>
       </w:pPr>
       <w:r>
         <w:rPr>
           <w:i/>
           <w:iCs/>
-          <w:color w:val="6B6B6B"/>
-          <w:sz w:val="18"/>
-          <w:szCs w:val="18"/>
         </w:rPr>
         <w:t xml:space="preserve">Source: DRAFT MNET Constitution, Code of Conduct — near verbatim.</w:t>
       </w:r>
@@ -639,16 +694,26 @@
     <w:p>
       <w:pPr>
         <w:pStyle w:val="Heading1"/>
-      </w:pPr>
-      <w:r>
+        <w:spacing w:after="160" w:before="360"/>
+      </w:pPr>
+      <w:r>
+        <w:rPr>
+          <w:b/>
+          <w:bCs/>
+        </w:rPr>
         <w:t xml:space="preserve">Article 4 — Organisational Structure</w:t>
       </w:r>
     </w:p>
     <w:p>
       <w:pPr>
         <w:pStyle w:val="Heading2"/>
-      </w:pPr>
-      <w:r>
+        <w:spacing w:after="120" w:before="240"/>
+      </w:pPr>
+      <w:r>
+        <w:rPr>
+          <w:b/>
+          <w:bCs/>
+        </w:rPr>
         <w:t xml:space="preserve">4.1 Departments</w:t>
       </w:r>
     </w:p>
@@ -715,8 +780,13 @@
     <w:p>
       <w:pPr>
         <w:pStyle w:val="Heading2"/>
-      </w:pPr>
-      <w:r>
+        <w:spacing w:after="120" w:before="240"/>
+      </w:pPr>
+      <w:r>
+        <w:rPr>
+          <w:b/>
+          <w:bCs/>
+        </w:rPr>
         <w:t xml:space="preserve">4.2 Portfolios</w:t>
       </w:r>
     </w:p>
@@ -731,8 +801,13 @@
     <w:p>
       <w:pPr>
         <w:pStyle w:val="Heading2"/>
-      </w:pPr>
-      <w:r>
+        <w:spacing w:after="120" w:before="240"/>
+      </w:pPr>
+      <w:r>
+        <w:rPr>
+          <w:b/>
+          <w:bCs/>
+        </w:rPr>
         <w:t xml:space="preserve">4.3 Leadership Team</w:t>
       </w:r>
     </w:p>
@@ -747,8 +822,13 @@
     <w:p>
       <w:pPr>
         <w:pStyle w:val="Heading2"/>
-      </w:pPr>
-      <w:r>
+        <w:spacing w:after="120" w:before="240"/>
+      </w:pPr>
+      <w:r>
+        <w:rPr>
+          <w:b/>
+          <w:bCs/>
+        </w:rPr>
         <w:t xml:space="preserve">4.4 Meetings</w:t>
       </w:r>
     </w:p>
@@ -848,32 +928,70 @@
     </w:p>
     <w:p>
       <w:pPr>
-        <w:spacing w:after="160"/>
+        <w:pStyle w:val="Heading2"/>
+        <w:spacing w:after="120" w:before="240"/>
+      </w:pPr>
+      <w:r>
+        <w:rPr>
+          <w:b/>
+          <w:bCs/>
+        </w:rPr>
+        <w:t xml:space="preserve">4.5 Scheduling — the MNET Schedule</w:t>
+      </w:r>
+    </w:p>
+    <w:p>
+      <w:pPr>
+        <w:spacing w:after="120"/>
+      </w:pPr>
+      <w:r>
+        <w:t xml:space="preserve">All meetings and events are managed on the shared team Google Calendar, the </w:t>
+      </w:r>
+      <w:r>
+        <w:rPr>
+          <w:b/>
+          <w:bCs/>
+        </w:rPr>
+        <w:t xml:space="preserve">MNET Schedule</w:t>
+      </w:r>
+      <w:r>
+        <w:t xml:space="preserve">, which updates in real time. Every member is automatically invited through their Monash email and must keep that account linked. Members are expected to RSVP ("Yes", "No", or "Maybe") to every invitation as early as possible, and to add a short note when unable to attend so leads can plan around attendance.</w:t>
+      </w:r>
+    </w:p>
+    <w:p>
+      <w:pPr>
+        <w:spacing w:after="120"/>
       </w:pPr>
       <w:r>
         <w:rPr>
           <w:i/>
           <w:iCs/>
-          <w:color w:val="6B6B6B"/>
-          <w:sz w:val="18"/>
-          <w:szCs w:val="18"/>
-        </w:rPr>
-        <w:t xml:space="preserve">Sources: Notion “New Meeting Structure”; Team Lead Handover §3.1 (Portfolio Activision) and §5 (meeting practices).</w:t>
+        </w:rPr>
+        <w:t xml:space="preserve">Sources: Notion "New Meeting Structure" and Welcome Pack; Team Lead Handover §3.1 (Portfolio Activision) and §5 (meeting practices).</w:t>
       </w:r>
     </w:p>
     <w:p>
       <w:pPr>
         <w:pStyle w:val="Heading1"/>
-      </w:pPr>
-      <w:r>
+        <w:spacing w:after="160" w:before="360"/>
+      </w:pPr>
+      <w:r>
+        <w:rPr>
+          <w:b/>
+          <w:bCs/>
+        </w:rPr>
         <w:t xml:space="preserve">Article 5 — Roles and Responsibilities</w:t>
       </w:r>
     </w:p>
     <w:p>
       <w:pPr>
         <w:pStyle w:val="Heading2"/>
-      </w:pPr>
-      <w:r>
+        <w:spacing w:after="120" w:before="240"/>
+      </w:pPr>
+      <w:r>
+        <w:rPr>
+          <w:b/>
+          <w:bCs/>
+        </w:rPr>
         <w:t xml:space="preserve">5.1 Team Lead(s)</w:t>
       </w:r>
     </w:p>
@@ -979,8 +1097,13 @@
     <w:p>
       <w:pPr>
         <w:pStyle w:val="Heading2"/>
-      </w:pPr>
-      <w:r>
+        <w:spacing w:after="120" w:before="240"/>
+      </w:pPr>
+      <w:r>
+        <w:rPr>
+          <w:b/>
+          <w:bCs/>
+        </w:rPr>
         <w:t xml:space="preserve">5.2 Department Leads</w:t>
       </w:r>
     </w:p>
@@ -1000,8 +1123,13 @@
     <w:p>
       <w:pPr>
         <w:pStyle w:val="Heading2"/>
-      </w:pPr>
-      <w:r>
+        <w:spacing w:after="120" w:before="240"/>
+      </w:pPr>
+      <w:r>
+        <w:rPr>
+          <w:b/>
+          <w:bCs/>
+        </w:rPr>
         <w:t xml:space="preserve">5.3 Portfolio Leads</w:t>
       </w:r>
     </w:p>
@@ -1021,8 +1149,13 @@
     <w:p>
       <w:pPr>
         <w:pStyle w:val="Heading2"/>
-      </w:pPr>
-      <w:r>
+        <w:spacing w:after="120" w:before="240"/>
+      </w:pPr>
+      <w:r>
+        <w:rPr>
+          <w:b/>
+          <w:bCs/>
+        </w:rPr>
         <w:t xml:space="preserve">5.4 Senior Members</w:t>
       </w:r>
     </w:p>
@@ -1037,8 +1170,13 @@
     <w:p>
       <w:pPr>
         <w:pStyle w:val="Heading2"/>
-      </w:pPr>
-      <w:r>
+        <w:spacing w:after="120" w:before="240"/>
+      </w:pPr>
+      <w:r>
+        <w:rPr>
+          <w:b/>
+          <w:bCs/>
+        </w:rPr>
         <w:t xml:space="preserve">5.5 Members, Probationary Members and Alumni</w:t>
       </w:r>
     </w:p>
@@ -1083,15 +1221,12 @@
     </w:p>
     <w:p>
       <w:pPr>
-        <w:spacing w:after="160"/>
+        <w:spacing w:after="120"/>
       </w:pPr>
       <w:r>
         <w:rPr>
           <w:i/>
           <w:iCs/>
-          <w:color w:val="6B6B6B"/>
-          <w:sz w:val="18"/>
-          <w:szCs w:val="18"/>
         </w:rPr>
         <w:t xml:space="preserve">Sources: Team Lead Handover §1 (verbatim purpose and responsibilities); DRAFT MNET Constitution (roles); 2026 Vision Handover (senior member policy).</w:t>
       </w:r>
@@ -1099,16 +1234,26 @@
     <w:p>
       <w:pPr>
         <w:pStyle w:val="Heading1"/>
-      </w:pPr>
-      <w:r>
+        <w:spacing w:after="160" w:before="360"/>
+      </w:pPr>
+      <w:r>
+        <w:rPr>
+          <w:b/>
+          <w:bCs/>
+        </w:rPr>
         <w:t xml:space="preserve">Article 6 — Membership</w:t>
       </w:r>
     </w:p>
     <w:p>
       <w:pPr>
         <w:pStyle w:val="Heading2"/>
-      </w:pPr>
-      <w:r>
+        <w:spacing w:after="120" w:before="240"/>
+      </w:pPr>
+      <w:r>
+        <w:rPr>
+          <w:b/>
+          <w:bCs/>
+        </w:rPr>
         <w:t xml:space="preserve">6.1 Recruitment</w:t>
       </w:r>
     </w:p>
@@ -1148,14 +1293,32 @@
         <w:spacing w:after="80"/>
       </w:pPr>
       <w:r>
+        <w:t xml:space="preserve">Whatever process is settled must comply with the Monash Student Teams Procedure (Article 13), including: written, accessible applications assessed by diverse, trained panels; a consistent set of core interview questions with grading criteria; declared conflicts of interest; recruitment documentation retained for one year; a probation period of three to six months with a formal review; and — from July 2026 — annual reapplication for all members, new and existing, with no guaranteed reselection.</w:t>
+      </w:r>
+    </w:p>
+    <w:p>
+      <w:pPr>
+        <w:pStyle w:val="ListParagraph"/>
+        <w:numPr>
+          <w:ilvl w:val="0"/>
+          <w:numId w:val="4"/>
+        </w:numPr>
+        <w:spacing w:after="80"/>
+      </w:pPr>
+      <w:r>
         <w:t xml:space="preserve">The team draws applicants from across Monash, with a strong pipeline from the Faculty of Information Technology’s Games and Immersive Media (GIM) major and related programs, alongside members from Engineering, Design, Science, and beyond.</w:t>
       </w:r>
     </w:p>
     <w:p>
       <w:pPr>
         <w:pStyle w:val="Heading2"/>
-      </w:pPr>
-      <w:r>
+        <w:spacing w:after="120" w:before="240"/>
+      </w:pPr>
+      <w:r>
+        <w:rPr>
+          <w:b/>
+          <w:bCs/>
+        </w:rPr>
         <w:t xml:space="preserve">6.2 Returning Members</w:t>
       </w:r>
     </w:p>
@@ -1214,8 +1377,13 @@
     <w:p>
       <w:pPr>
         <w:pStyle w:val="Heading2"/>
-      </w:pPr>
-      <w:r>
+        <w:spacing w:after="120" w:before="240"/>
+      </w:pPr>
+      <w:r>
+        <w:rPr>
+          <w:b/>
+          <w:bCs/>
+        </w:rPr>
         <w:t xml:space="preserve">6.3 Onboarding</w:t>
       </w:r>
     </w:p>
@@ -1224,14 +1392,19 @@
         <w:spacing w:after="120"/>
       </w:pPr>
       <w:r>
-        <w:t xml:space="preserve">New members complete the onboarding process: the Welcome Pack, onboarding and induction forms, media consent form, and access provisioning (Notion, Google Drive, Discord, calendar). Facility access requires the relevant inductions (Makerspace, Design &amp; Build, and lab-specific inductions).</w:t>
+        <w:t xml:space="preserve">New members complete the onboarding process: the Welcome Pack, onboarding and induction forms, media consent form, and access provisioning (Notion, Google Drive, Discord, calendar). Facility access requires the relevant inductions (Makerspace, Design &amp; Build, and lab-specific inductions). Under the Student Teams Procedure, onboarding training — including Respect at Monash and the required OHS inductions — is completed within three months of joining.</w:t>
       </w:r>
     </w:p>
     <w:p>
       <w:pPr>
         <w:pStyle w:val="Heading2"/>
-      </w:pPr>
-      <w:r>
+        <w:spacing w:after="120" w:before="240"/>
+      </w:pPr>
+      <w:r>
+        <w:rPr>
+          <w:b/>
+          <w:bCs/>
+        </w:rPr>
         <w:t xml:space="preserve">6.4 Leaving the Team</w:t>
       </w:r>
     </w:p>
@@ -1245,32 +1418,78 @@
     </w:p>
     <w:p>
       <w:pPr>
-        <w:spacing w:after="160"/>
+        <w:pStyle w:val="Heading2"/>
+        <w:spacing w:after="120" w:before="240"/>
+      </w:pPr>
+      <w:r>
+        <w:rPr>
+          <w:b/>
+          <w:bCs/>
+        </w:rPr>
+        <w:t xml:space="preserve">6.5 Recognition, CPD and Course Credit</w:t>
+      </w:r>
+    </w:p>
+    <w:p>
+      <w:pPr>
+        <w:pStyle w:val="ListParagraph"/>
+        <w:numPr>
+          <w:ilvl w:val="0"/>
+          <w:numId w:val="3"/>
+        </w:numPr>
+        <w:spacing w:after="60"/>
+      </w:pPr>
+      <w:r>
+        <w:t xml:space="preserve">One year of active team membership is recognised under current Engineers Australia CPD guidelines as 420 hours of experience, pro-rated by membership time (minimum six months’ confirmed membership for the minimum 240 hours). CPD statements are prepared by the leadership group and signed through the team’s advisors or the Director of Student Teams.</w:t>
+      </w:r>
+    </w:p>
+    <w:p>
+      <w:pPr>
+        <w:pStyle w:val="ListParagraph"/>
+        <w:numPr>
+          <w:ilvl w:val="0"/>
+          <w:numId w:val="3"/>
+        </w:numPr>
+        <w:spacing w:after="60"/>
+      </w:pPr>
+      <w:r>
+        <w:t xml:space="preserve">Members may take ENG4802 Professional Practice (Student teams) for course credit — open to Engineering and IT student-team members since Semester 1, 2024 (30% flexible online modules, 70% e-portfolio built on team contributions).</w:t>
+      </w:r>
+    </w:p>
+    <w:p>
+      <w:pPr>
+        <w:spacing w:after="120"/>
       </w:pPr>
       <w:r>
         <w:rPr>
           <w:i/>
           <w:iCs/>
-          <w:color w:val="6B6B6B"/>
-          <w:sz w:val="18"/>
-          <w:szCs w:val="18"/>
-        </w:rPr>
-        <w:t xml:space="preserve">Sources: DRAFT MNET Constitution (returning, leaving). Recruitment process documentation pending (2026 review).</w:t>
+        </w:rPr>
+        <w:t xml:space="preserve">Sources: DRAFT MNET Constitution (returning, leaving); Monash Student Teams Procedure Ver 2 (recruitment, probation, onboarding, CPD); ENG4802 Overview and FAQs. Recruitment process documentation pending (2026 review).</w:t>
       </w:r>
     </w:p>
     <w:p>
       <w:pPr>
         <w:pStyle w:val="Heading1"/>
-      </w:pPr>
-      <w:r>
+        <w:spacing w:after="160" w:before="360"/>
+      </w:pPr>
+      <w:r>
+        <w:rPr>
+          <w:b/>
+          <w:bCs/>
+        </w:rPr>
         <w:t xml:space="preserve">Article 7 — Leadership Selection, Terms and Handover</w:t>
       </w:r>
     </w:p>
     <w:p>
       <w:pPr>
         <w:pStyle w:val="Heading2"/>
-      </w:pPr>
-      <w:r>
+        <w:spacing w:after="120" w:before="240"/>
+      </w:pPr>
+      <w:r>
+        <w:rPr>
+          <w:b/>
+          <w:bCs/>
+        </w:rPr>
         <w:t xml:space="preserve">7.1 Selection</w:t>
       </w:r>
     </w:p>
@@ -1328,9 +1547,27 @@
     </w:p>
     <w:p>
       <w:pPr>
+        <w:pStyle w:val="ListParagraph"/>
+        <w:numPr>
+          <w:ilvl w:val="0"/>
+          <w:numId w:val="5"/>
+        </w:numPr>
+        <w:spacing w:after="80"/>
+      </w:pPr>
+      <w:r>
+        <w:t xml:space="preserve">Under the Monash Student Teams Procedure (Article 13), executives are formally endorsed by the team’s Academic Advisors before being announced, and senior non-technical leadership appointments are additionally interviewed by a gender-balanced panel involving staff, with scenario questions prioritising empathy, conflict management, ethical reasoning, communication, and team-culture stewardship. MSTI runs annual leadership training for incoming leads.</w:t>
+      </w:r>
+    </w:p>
+    <w:p>
+      <w:pPr>
         <w:pStyle w:val="Heading2"/>
-      </w:pPr>
-      <w:r>
+        <w:spacing w:after="120" w:before="240"/>
+      </w:pPr>
+      <w:r>
+        <w:rPr>
+          <w:b/>
+          <w:bCs/>
+        </w:rPr>
         <w:t xml:space="preserve">7.2 Terms</w:t>
       </w:r>
     </w:p>
@@ -1339,7 +1576,7 @@
         <w:pStyle w:val="ListParagraph"/>
         <w:numPr>
           <w:ilvl w:val="0"/>
-          <w:numId w:val="5"/>
+          <w:numId w:val="6"/>
         </w:numPr>
         <w:spacing w:after="80"/>
       </w:pPr>
@@ -1352,7 +1589,7 @@
         <w:pStyle w:val="ListParagraph"/>
         <w:numPr>
           <w:ilvl w:val="0"/>
-          <w:numId w:val="5"/>
+          <w:numId w:val="6"/>
         </w:numPr>
         <w:spacing w:after="80"/>
       </w:pPr>
@@ -1363,8 +1600,13 @@
     <w:p>
       <w:pPr>
         <w:pStyle w:val="Heading2"/>
-      </w:pPr>
-      <w:r>
+        <w:spacing w:after="120" w:before="240"/>
+      </w:pPr>
+      <w:r>
+        <w:rPr>
+          <w:b/>
+          <w:bCs/>
+        </w:rPr>
         <w:t xml:space="preserve">7.3 Handover</w:t>
       </w:r>
     </w:p>
@@ -1373,7 +1615,7 @@
         <w:pStyle w:val="ListParagraph"/>
         <w:numPr>
           <w:ilvl w:val="0"/>
-          <w:numId w:val="5"/>
+          <w:numId w:val="7"/>
         </w:numPr>
         <w:spacing w:after="80"/>
       </w:pPr>
@@ -1386,7 +1628,7 @@
         <w:pStyle w:val="ListParagraph"/>
         <w:numPr>
           <w:ilvl w:val="0"/>
-          <w:numId w:val="5"/>
+          <w:numId w:val="7"/>
         </w:numPr>
         <w:spacing w:after="80"/>
       </w:pPr>
@@ -1399,7 +1641,7 @@
         <w:pStyle w:val="ListParagraph"/>
         <w:numPr>
           <w:ilvl w:val="0"/>
-          <w:numId w:val="5"/>
+          <w:numId w:val="7"/>
         </w:numPr>
         <w:spacing w:after="80"/>
       </w:pPr>
@@ -1409,24 +1651,26 @@
     </w:p>
     <w:p>
       <w:pPr>
-        <w:spacing w:after="160"/>
+        <w:spacing w:after="120"/>
       </w:pPr>
       <w:r>
         <w:rPr>
           <w:i/>
           <w:iCs/>
-          <w:color w:val="6B6B6B"/>
-          <w:sz w:val="18"/>
-          <w:szCs w:val="18"/>
-        </w:rPr>
-        <w:t xml:space="preserve">Sources: DRAFT MNET Constitution (selection); Team Lead Handover §2, §6 and “Team Process” (terms, handover, access transfer).</w:t>
+        </w:rPr>
+        <w:t xml:space="preserve">Sources: DRAFT MNET Constitution (selection); Team Lead Handover §2, §6 and "Team Process" (terms, handover, access transfer); Monash Student Teams Procedure Ver 2 (endorsement and panel requirements).</w:t>
       </w:r>
     </w:p>
     <w:p>
       <w:pPr>
         <w:pStyle w:val="Heading1"/>
-      </w:pPr>
-      <w:r>
+        <w:spacing w:after="160" w:before="360"/>
+      </w:pPr>
+      <w:r>
+        <w:rPr>
+          <w:b/>
+          <w:bCs/>
+        </w:rPr>
         <w:t xml:space="preserve">Article 8 — Disciplinary Action and Dismissal</w:t>
       </w:r>
     </w:p>
@@ -1435,7 +1679,7 @@
         <w:pStyle w:val="ListParagraph"/>
         <w:numPr>
           <w:ilvl w:val="0"/>
-          <w:numId w:val="6"/>
+          <w:numId w:val="8"/>
         </w:numPr>
         <w:spacing w:after="80"/>
       </w:pPr>
@@ -1448,7 +1692,7 @@
         <w:pStyle w:val="ListParagraph"/>
         <w:numPr>
           <w:ilvl w:val="0"/>
-          <w:numId w:val="6"/>
+          <w:numId w:val="8"/>
         </w:numPr>
         <w:spacing w:after="80"/>
       </w:pPr>
@@ -1461,7 +1705,7 @@
         <w:pStyle w:val="ListParagraph"/>
         <w:numPr>
           <w:ilvl w:val="0"/>
-          <w:numId w:val="6"/>
+          <w:numId w:val="8"/>
         </w:numPr>
         <w:spacing w:after="80"/>
       </w:pPr>
@@ -1474,7 +1718,7 @@
         <w:pStyle w:val="ListParagraph"/>
         <w:numPr>
           <w:ilvl w:val="0"/>
-          <w:numId w:val="6"/>
+          <w:numId w:val="8"/>
         </w:numPr>
         <w:spacing w:after="80"/>
       </w:pPr>
@@ -1487,7 +1731,7 @@
         <w:pStyle w:val="ListParagraph"/>
         <w:numPr>
           <w:ilvl w:val="0"/>
-          <w:numId w:val="6"/>
+          <w:numId w:val="8"/>
         </w:numPr>
         <w:spacing w:after="80"/>
       </w:pPr>
@@ -1497,24 +1741,39 @@
     </w:p>
     <w:p>
       <w:pPr>
-        <w:spacing w:after="160"/>
+        <w:pStyle w:val="ListParagraph"/>
+        <w:numPr>
+          <w:ilvl w:val="0"/>
+          <w:numId w:val="8"/>
+        </w:numPr>
+        <w:spacing w:after="80"/>
+      </w:pPr>
+      <w:r>
+        <w:t xml:space="preserve">Serious misconduct is handled under the university’s procedures (Student General Misconduct Procedure; Sexual Harm Response Procedure). Under the Student Teams Procedure, the Director of Student Teams acts as the Responsible Officer for general misconduct, and code breaches are reported to Safer Communities or the Student Experience Coordinators.</w:t>
+      </w:r>
+    </w:p>
+    <w:p>
+      <w:pPr>
+        <w:spacing w:after="120"/>
       </w:pPr>
       <w:r>
         <w:rPr>
           <w:i/>
           <w:iCs/>
-          <w:color w:val="6B6B6B"/>
-          <w:sz w:val="18"/>
-          <w:szCs w:val="18"/>
-        </w:rPr>
-        <w:t xml:space="preserve">Source: DRAFT MNET Constitution (disciplinary action) — near verbatim.</w:t>
+        </w:rPr>
+        <w:t xml:space="preserve">Sources: DRAFT MNET Constitution (disciplinary action) — near verbatim; Monash Student Teams Procedure Ver 2 (misconduct escalation).</w:t>
       </w:r>
     </w:p>
     <w:p>
       <w:pPr>
         <w:pStyle w:val="Heading1"/>
-      </w:pPr>
-      <w:r>
+        <w:spacing w:after="160" w:before="360"/>
+      </w:pPr>
+      <w:r>
+        <w:rPr>
+          <w:b/>
+          <w:bCs/>
+        </w:rPr>
         <w:t xml:space="preserve">Article 9 — Advisors and Stakeholders</w:t>
       </w:r>
     </w:p>
@@ -1523,7 +1782,7 @@
         <w:pStyle w:val="ListParagraph"/>
         <w:numPr>
           <w:ilvl w:val="0"/>
-          <w:numId w:val="7"/>
+          <w:numId w:val="9"/>
         </w:numPr>
         <w:spacing w:after="80"/>
       </w:pPr>
@@ -1536,7 +1795,7 @@
         <w:pStyle w:val="ListParagraph"/>
         <w:numPr>
           <w:ilvl w:val="0"/>
-          <w:numId w:val="7"/>
+          <w:numId w:val="9"/>
         </w:numPr>
         <w:spacing w:after="80"/>
       </w:pPr>
@@ -1549,7 +1808,7 @@
         <w:pStyle w:val="ListParagraph"/>
         <w:numPr>
           <w:ilvl w:val="0"/>
-          <w:numId w:val="7"/>
+          <w:numId w:val="9"/>
         </w:numPr>
         <w:spacing w:after="80"/>
       </w:pPr>
@@ -1562,7 +1821,7 @@
         <w:pStyle w:val="ListParagraph"/>
         <w:numPr>
           <w:ilvl w:val="0"/>
-          <w:numId w:val="7"/>
+          <w:numId w:val="9"/>
         </w:numPr>
         <w:spacing w:after="80"/>
       </w:pPr>
@@ -1575,7 +1834,7 @@
         <w:pStyle w:val="ListParagraph"/>
         <w:numPr>
           <w:ilvl w:val="0"/>
-          <w:numId w:val="7"/>
+          <w:numId w:val="9"/>
         </w:numPr>
         <w:spacing w:after="80"/>
       </w:pPr>
@@ -1588,7 +1847,7 @@
         <w:pStyle w:val="ListParagraph"/>
         <w:numPr>
           <w:ilvl w:val="0"/>
-          <w:numId w:val="7"/>
+          <w:numId w:val="9"/>
         </w:numPr>
         <w:spacing w:after="80"/>
       </w:pPr>
@@ -1598,15 +1857,12 @@
     </w:p>
     <w:p>
       <w:pPr>
-        <w:spacing w:after="160"/>
+        <w:spacing w:after="120"/>
       </w:pPr>
       <w:r>
         <w:rPr>
           <w:i/>
           <w:iCs/>
-          <w:color w:val="6B6B6B"/>
-          <w:sz w:val="18"/>
-          <w:szCs w:val="18"/>
         </w:rPr>
         <w:t xml:space="preserve">Sources: Team Lead Handover §4; Supervisor Information folder (2026 MOUs).</w:t>
       </w:r>
@@ -1614,8 +1870,13 @@
     <w:p>
       <w:pPr>
         <w:pStyle w:val="Heading1"/>
-      </w:pPr>
-      <w:r>
+        <w:spacing w:after="160" w:before="360"/>
+      </w:pPr>
+      <w:r>
+        <w:rPr>
+          <w:b/>
+          <w:bCs/>
+        </w:rPr>
         <w:t xml:space="preserve">Article 10 — Partnerships, Sponsorship and Philanthropy</w:t>
       </w:r>
     </w:p>
@@ -1624,7 +1885,7 @@
         <w:pStyle w:val="ListParagraph"/>
         <w:numPr>
           <w:ilvl w:val="0"/>
-          <w:numId w:val="8"/>
+          <w:numId w:val="10"/>
         </w:numPr>
         <w:spacing w:after="80"/>
       </w:pPr>
@@ -1637,7 +1898,7 @@
         <w:pStyle w:val="ListParagraph"/>
         <w:numPr>
           <w:ilvl w:val="0"/>
-          <w:numId w:val="8"/>
+          <w:numId w:val="10"/>
         </w:numPr>
         <w:spacing w:after="80"/>
       </w:pPr>
@@ -1650,7 +1911,7 @@
         <w:pStyle w:val="ListParagraph"/>
         <w:numPr>
           <w:ilvl w:val="0"/>
-          <w:numId w:val="8"/>
+          <w:numId w:val="10"/>
         </w:numPr>
         <w:spacing w:after="80"/>
       </w:pPr>
@@ -1663,7 +1924,7 @@
         <w:pStyle w:val="ListParagraph"/>
         <w:numPr>
           <w:ilvl w:val="0"/>
-          <w:numId w:val="8"/>
+          <w:numId w:val="10"/>
         </w:numPr>
         <w:spacing w:after="80"/>
       </w:pPr>
@@ -1676,7 +1937,7 @@
         <w:pStyle w:val="ListParagraph"/>
         <w:numPr>
           <w:ilvl w:val="0"/>
-          <w:numId w:val="8"/>
+          <w:numId w:val="10"/>
         </w:numPr>
         <w:spacing w:after="80"/>
       </w:pPr>
@@ -1686,32 +1947,52 @@
     </w:p>
     <w:p>
       <w:pPr>
-        <w:spacing w:after="160"/>
+        <w:pStyle w:val="ListParagraph"/>
+        <w:numPr>
+          <w:ilvl w:val="0"/>
+          <w:numId w:val="10"/>
+        </w:numPr>
+        <w:spacing w:after="80"/>
+      </w:pPr>
+      <w:r>
+        <w:t xml:space="preserve">Stakeholders engaged to date (per the 2025 End of Year Report to MSTI) include Microsoft, Telstra, EY, Capgemini, Hewlett Packard Enterprise, Blackmagic Design, 360 Productions AU, Engineers Australia, ANSTO, CrowdStrike, XENON High Performance Computing, Macquarie Bank, Databricks, Altair, Ventia, MindFlight7, Canopy Creative, Meta and Moderna, alongside Stanford University and the Monash Sustainable Development Institute.</w:t>
+      </w:r>
+    </w:p>
+    <w:p>
+      <w:pPr>
+        <w:spacing w:after="120"/>
       </w:pPr>
       <w:r>
         <w:rPr>
           <w:i/>
           <w:iCs/>
-          <w:color w:val="6B6B6B"/>
-          <w:sz w:val="18"/>
-          <w:szCs w:val="18"/>
-        </w:rPr>
-        <w:t xml:space="preserve">Sources: 2025 Prospectus (tiers, collaboration terms, philanthropy); Team Lead Handover §3.2.1 (sponsorship processing).</w:t>
+        </w:rPr>
+        <w:t xml:space="preserve">Sources: 2025 Prospectus (tiers, collaboration terms, philanthropy); Team Lead Handover §3.2.1 (sponsorship processing); 2025 End of Year Report (stakeholders).</w:t>
       </w:r>
     </w:p>
     <w:p>
       <w:pPr>
         <w:pStyle w:val="Heading1"/>
-      </w:pPr>
-      <w:r>
+        <w:spacing w:after="160" w:before="360"/>
+      </w:pPr>
+      <w:r>
+        <w:rPr>
+          <w:b/>
+          <w:bCs/>
+        </w:rPr>
         <w:t xml:space="preserve">Article 11 — Operations, Finance and Assets</w:t>
       </w:r>
     </w:p>
     <w:p>
       <w:pPr>
         <w:pStyle w:val="Heading2"/>
-      </w:pPr>
-      <w:r>
+        <w:spacing w:after="120" w:before="240"/>
+      </w:pPr>
+      <w:r>
+        <w:rPr>
+          <w:b/>
+          <w:bCs/>
+        </w:rPr>
         <w:t xml:space="preserve">11.1 Tools and Infrastructure</w:t>
       </w:r>
     </w:p>
@@ -1738,7 +2019,7 @@
         <w:spacing w:after="60"/>
       </w:pPr>
       <w:r>
-        <w:t xml:space="preserve">Google Workspace — team Drive, team calendar, and mnet@monash.edu (delegated to current leadership).</w:t>
+        <w:t xml:space="preserve">Google Workspace — team Drive, team calendar (the MNET Schedule, Article 4.5), and mnet@monash.edu (delegated to current leadership).</w:t>
       </w:r>
     </w:p>
     <w:p>
@@ -1770,8 +2051,13 @@
     <w:p>
       <w:pPr>
         <w:pStyle w:val="Heading2"/>
-      </w:pPr>
-      <w:r>
+        <w:spacing w:after="120" w:before="240"/>
+      </w:pPr>
+      <w:r>
+        <w:rPr>
+          <w:b/>
+          <w:bCs/>
+        </w:rPr>
         <w:t xml:space="preserve">11.2 Finance</w:t>
       </w:r>
     </w:p>
@@ -1811,14 +2097,32 @@
         <w:spacing w:after="60"/>
       </w:pPr>
       <w:r>
+        <w:t xml:space="preserve">Team funding is provisioned through the Faculty of IT via MSTI and released in tranches against an approved plan (for the record: 2024 — $4,000 MSTI; 2025 — $6,500 MSTI plus $2,150 FIT; the 2025 second tranche was conditional on all funds being spent by 1 September). Additional funding requires sponsorship or external partners (Article 10).</w:t>
+      </w:r>
+    </w:p>
+    <w:p>
+      <w:pPr>
+        <w:pStyle w:val="ListParagraph"/>
+        <w:numPr>
+          <w:ilvl w:val="0"/>
+          <w:numId w:val="3"/>
+        </w:numPr>
+        <w:spacing w:after="60"/>
+      </w:pPr>
+      <w:r>
         <w:t xml:space="preserve">Finance access and approval details are recorded in the internal handover documents, not in this constitution.</w:t>
       </w:r>
     </w:p>
     <w:p>
       <w:pPr>
         <w:pStyle w:val="Heading2"/>
-      </w:pPr>
-      <w:r>
+        <w:spacing w:after="120" w:before="240"/>
+      </w:pPr>
+      <w:r>
+        <w:rPr>
+          <w:b/>
+          <w:bCs/>
+        </w:rPr>
         <w:t xml:space="preserve">11.3 Assets and Facilities</w:t>
       </w:r>
     </w:p>
@@ -1837,24 +2141,39 @@
     </w:p>
     <w:p>
       <w:pPr>
-        <w:spacing w:after="160"/>
+        <w:pStyle w:val="ListParagraph"/>
+        <w:numPr>
+          <w:ilvl w:val="0"/>
+          <w:numId w:val="3"/>
+        </w:numPr>
+        <w:spacing w:after="60"/>
+      </w:pPr>
+      <w:r>
+        <w:t xml:space="preserve">MSTI/Makerspace shared assets — vehicles, trailers, and camera/marketing gear — are booked through the Reftab portal, subject to the required inductions and the Procedure’s sharing etiquette.</w:t>
+      </w:r>
+    </w:p>
+    <w:p>
+      <w:pPr>
+        <w:spacing w:after="120"/>
       </w:pPr>
       <w:r>
         <w:rPr>
           <w:i/>
           <w:iCs/>
-          <w:color w:val="6B6B6B"/>
-          <w:sz w:val="18"/>
-          <w:szCs w:val="18"/>
-        </w:rPr>
-        <w:t xml:space="preserve">Sources: Team Lead Handover §2 and Access Permission Transfer Process; Operations department records.</w:t>
+        </w:rPr>
+        <w:t xml:space="preserve">Sources: Team Lead Handover §2 and Access Permission Transfer Process; Operations department records; 2024/2025 End of Year Reports (funding); Monash Student Teams Procedure Ver 2 (Reftab).</w:t>
       </w:r>
     </w:p>
     <w:p>
       <w:pPr>
         <w:pStyle w:val="Heading1"/>
-      </w:pPr>
-      <w:r>
+        <w:spacing w:after="160" w:before="360"/>
+      </w:pPr>
+      <w:r>
+        <w:rPr>
+          <w:b/>
+          <w:bCs/>
+        </w:rPr>
         <w:t xml:space="preserve">Article 12 — Events and Outreach</w:t>
       </w:r>
     </w:p>
@@ -1868,7 +2187,7 @@
         <w:spacing w:after="60"/>
       </w:pPr>
       <w:r>
-        <w:t xml:space="preserve">Recurring activations: O-Week (each semester), IT Fair (semester 1, week 1), Open Day (semester 2), and one to three showcases across the year.</w:t>
+        <w:t xml:space="preserve">Recurring activations: O-Week (each semester), IT Fair (semester 1, week 1), Open Day (semester 2), Tech Futures Industry Nights (with MDN and MAC), and one to three showcases across the year.</w:t>
       </w:r>
     </w:p>
     <w:p>
@@ -1907,20 +2226,17 @@
         <w:spacing w:after="60"/>
       </w:pPr>
       <w:r>
-        <w:t xml:space="preserve">Events involving travel require a travel plan with approximately 6 months’ notice for interstate travel and 12–18 months for international travel, using university-approved travel arrangements.</w:t>
-      </w:r>
-    </w:p>
-    <w:p>
-      <w:pPr>
-        <w:spacing w:after="160"/>
+        <w:t xml:space="preserve">Events involving travel require a travel plan with approximately 6 months’ notice for interstate travel and 12–18 months for international travel, using university-approved travel arrangements. Overnight travel additionally follows the MSTI travel EOI and approval process (Article 13).</w:t>
+      </w:r>
+    </w:p>
+    <w:p>
+      <w:pPr>
+        <w:spacing w:after="120"/>
       </w:pPr>
       <w:r>
         <w:rPr>
           <w:i/>
           <w:iCs/>
-          <w:color w:val="6B6B6B"/>
-          <w:sz w:val="18"/>
-          <w:szCs w:val="18"/>
         </w:rPr>
         <w:t xml:space="preserve">Sources: Team Lead Handover §3.2.1 (Events); MNET General Handover (event management).</w:t>
       </w:r>
@@ -1928,104 +2244,182 @@
     <w:p>
       <w:pPr>
         <w:pStyle w:val="Heading1"/>
-      </w:pPr>
-      <w:r>
-        <w:t xml:space="preserve">Article 13 — Amendments and Ratification</w:t>
-      </w:r>
-    </w:p>
-    <w:p>
-      <w:pPr>
-        <w:pStyle w:val="ListParagraph"/>
-        <w:numPr>
-          <w:ilvl w:val="0"/>
-          <w:numId w:val="9"/>
-        </w:numPr>
-        <w:spacing w:after="80"/>
-      </w:pPr>
-      <w:r>
-        <w:t xml:space="preserve">This constitution is reviewed at least once per year by the leadership team, with the history record (Appendix A) updated at each leadership handover.</w:t>
-      </w:r>
-    </w:p>
-    <w:p>
-      <w:pPr>
-        <w:pStyle w:val="ListParagraph"/>
-        <w:numPr>
-          <w:ilvl w:val="0"/>
-          <w:numId w:val="9"/>
-        </w:numPr>
-        <w:spacing w:after="80"/>
-      </w:pPr>
-      <w:r>
-        <w:t xml:space="preserve">Amendments are proposed in writing and adopted by decision of the leadership team.</w:t>
-      </w:r>
-    </w:p>
-    <w:p>
-      <w:pPr>
-        <w:pStyle w:val="ListParagraph"/>
-        <w:numPr>
-          <w:ilvl w:val="0"/>
-          <w:numId w:val="9"/>
-        </w:numPr>
-        <w:spacing w:after="80"/>
-      </w:pPr>
-      <w:r>
-        <w:t xml:space="preserve">Until ratified, this document is a working draft and does not bind the team.</w:t>
+        <w:spacing w:after="160" w:before="360"/>
+      </w:pPr>
+      <w:r>
+        <w:rPr>
+          <w:b/>
+          <w:bCs/>
+        </w:rPr>
+        <w:t xml:space="preserve">Article 13 — Governance within the University</w:t>
+      </w:r>
+    </w:p>
+    <w:p>
+      <w:pPr>
+        <w:pStyle w:val="ListParagraph"/>
+        <w:numPr>
+          <w:ilvl w:val="0"/>
+          <w:numId w:val="11"/>
+        </w:numPr>
+        <w:spacing w:after="80"/>
+      </w:pPr>
+      <w:r>
+        <w:t xml:space="preserve">MNET is an endorsed team of the Monash Student Team Initiative. MSTI teams are governed by the </w:t>
+      </w:r>
+      <w:r>
+        <w:rPr>
+          <w:b/>
+          <w:bCs/>
+        </w:rPr>
+        <w:t xml:space="preserve">Monash Student Teams Procedure</w:t>
+      </w:r>
+      <w:r>
+        <w:t xml:space="preserve"> (Version 2, effective 2 July 2026; review July 2029). Teams are not permitted to develop procedures that conflict with that document; this constitution must align with, and defers to, the Procedure and all relevant University policies.</w:t>
+      </w:r>
+    </w:p>
+    <w:p>
+      <w:pPr>
+        <w:pStyle w:val="ListParagraph"/>
+        <w:numPr>
+          <w:ilvl w:val="0"/>
+          <w:numId w:val="11"/>
+        </w:numPr>
+        <w:spacing w:after="80"/>
+      </w:pPr>
+      <w:r>
+        <w:t xml:space="preserve">Key obligations under the Procedure include: the Student Code of Conduct (Article 3); alcohol-free team events (Faculty Executive, May 2026); equity, diversity and anti-discrimination requirements, including gender-balanced recruiting practices; documented recruitment with probation and annual reapplication from July 2026 (Article 6); onboarding training within three months of joining; and the multi-stage travel expression-of-interest and approval process for domestic and international overnight travel (including traveller vetting and, from 2027, a WAM ≥ 60 requirement).</w:t>
+      </w:r>
+    </w:p>
+    <w:p>
+      <w:pPr>
+        <w:pStyle w:val="ListParagraph"/>
+        <w:numPr>
+          <w:ilvl w:val="0"/>
+          <w:numId w:val="11"/>
+        </w:numPr>
+        <w:spacing w:after="80"/>
+      </w:pPr>
+      <w:r>
+        <w:t xml:space="preserve">A twice-yearly governance review committee reviews existing teams, new team requests, budget distribution, and alignment with the University’s strategic plan (Impact 2030). As of December 2025, an organisational structure approved by the Faculty Executive separates facility management (the Makerspace network) from student-team oversight, with the Director of Student Teams in a strategic role supported by professional staff (Student Experience Coordinators and technical officers for risk and safety).</w:t>
+      </w:r>
+    </w:p>
+    <w:p>
+      <w:pPr>
+        <w:pStyle w:val="ListParagraph"/>
+        <w:numPr>
+          <w:ilvl w:val="0"/>
+          <w:numId w:val="11"/>
+        </w:numPr>
+        <w:spacing w:after="80"/>
+      </w:pPr>
+      <w:r>
+        <w:t xml:space="preserve">Reporting: MNET submits an End of Year Report to MSTI each December using the provided template, covering demographics, operations, events and engagement, social media data, finances (cash expenses and funding), conclusions, and the next year’s funding request. The 2024 and 2025 reports are the canonical record of the team’s activities and growth.</w:t>
+      </w:r>
+    </w:p>
+    <w:p>
+      <w:pPr>
+        <w:pStyle w:val="ListParagraph"/>
+        <w:numPr>
+          <w:ilvl w:val="0"/>
+          <w:numId w:val="11"/>
+        </w:numPr>
+        <w:spacing w:after="80"/>
+      </w:pPr>
+      <w:r>
+        <w:t xml:space="preserve">Faculty context: the Faculty of Engineering took over primary funding of student teams from the Engineering departments in 2021; MNET’s funding is provisioned through the Faculty of IT (Article 11.2). MNET coordinates with MSTI and the Faculty of IT through ITTA (the IT Teams Association, of which the team was a founding participant in October–November 2023) and the trimesterly MSTI Forums (Article 4.4).</w:t>
       </w:r>
     </w:p>
     <w:p>
       <w:pPr>
         <w:spacing w:after="120"/>
-        <w:ind w:left="360"/>
-      </w:pPr>
-      <w:r>
-        <w:rPr>
-          <w:b/>
-          <w:bCs/>
-          <w:color w:val="DC003B"/>
-        </w:rPr>
-        <w:t xml:space="preserve">OPEN QUESTION: </w:t>
-      </w:r>
+      </w:pPr>
       <w:r>
         <w:rPr>
           <w:i/>
           <w:iCs/>
-          <w:color w:val="6B6B6B"/>
-        </w:rPr>
-        <w:t xml:space="preserve">Ratification mechanism to decide: leadership vote only, all-member vote, or leadership vote with advisor endorsement.</w:t>
-      </w:r>
-    </w:p>
-    <w:p>
-      <w:pPr>
-        <w:spacing w:after="120"/>
-        <w:ind w:left="360"/>
-      </w:pPr>
-      <w:r>
-        <w:rPr>
-          <w:b/>
-          <w:bCs/>
-          <w:color w:val="DC003B"/>
-        </w:rPr>
-        <w:t xml:space="preserve">OPEN QUESTION: </w:t>
-      </w:r>
-      <w:r>
-        <w:rPr>
+        </w:rPr>
+        <w:t xml:space="preserve">Sources: Monash Student Teams Procedure Ver 2 (02/07/2026); MSTI End of Year Report templates; ITTA meeting archive (2023–2024); Student Teams shared drive.</w:t>
+      </w:r>
+    </w:p>
+    <w:p>
+      <w:pPr>
+        <w:pStyle w:val="Heading1"/>
+        <w:spacing w:after="160" w:before="360"/>
+      </w:pPr>
+      <w:r>
+        <w:rPr>
+          <w:b/>
+          <w:bCs/>
+        </w:rPr>
+        <w:t xml:space="preserve">Article 14 — Amendments and Ratification</w:t>
+      </w:r>
+    </w:p>
+    <w:p>
+      <w:pPr>
+        <w:pStyle w:val="ListParagraph"/>
+        <w:numPr>
+          <w:ilvl w:val="0"/>
+          <w:numId w:val="12"/>
+        </w:numPr>
+        <w:spacing w:after="80"/>
+      </w:pPr>
+      <w:r>
+        <w:t xml:space="preserve">This constitution is reviewed at least once per year by the leadership team, with the history record (Appendix A) updated at each leadership handover.</w:t>
+      </w:r>
+    </w:p>
+    <w:p>
+      <w:pPr>
+        <w:pStyle w:val="ListParagraph"/>
+        <w:numPr>
+          <w:ilvl w:val="0"/>
+          <w:numId w:val="12"/>
+        </w:numPr>
+        <w:spacing w:after="80"/>
+      </w:pPr>
+      <w:r>
+        <w:t xml:space="preserve">Amendments are proposed in writing and adopted by decision of the leadership team.</w:t>
+      </w:r>
+    </w:p>
+    <w:p>
+      <w:pPr>
+        <w:pStyle w:val="ListParagraph"/>
+        <w:numPr>
+          <w:ilvl w:val="0"/>
+          <w:numId w:val="12"/>
+        </w:numPr>
+        <w:spacing w:after="80"/>
+      </w:pPr>
+      <w:r>
+        <w:t xml:space="preserve">Nothing in this constitution overrides the Monash Student Teams Procedure or University policy (Article 13).</w:t>
+      </w:r>
+    </w:p>
+    <w:p>
+      <w:pPr>
+        <w:pStyle w:val="ListParagraph"/>
+        <w:numPr>
+          <w:ilvl w:val="0"/>
+          <w:numId w:val="12"/>
+        </w:numPr>
+        <w:spacing w:after="80"/>
+      </w:pPr>
+      <w:r>
+        <w:t xml:space="preserve">Until ratified, this document is a working draft and does not bind the team.</w:t>
+      </w:r>
+    </w:p>
+    <w:p>
+      <w:pPr>
+        <w:pBdr>
+          <w:left w:val="single" w:color="888888" w:sz="18" w:space="8"/>
+        </w:pBdr>
+        <w:spacing w:after="160" w:before="120"/>
+        <w:ind w:left="576"/>
+      </w:pPr>
+      <w:r>
+        <w:rPr>
+          <w:b/>
+          <w:bCs/>
           <w:i/>
           <w:iCs/>
-          <w:color w:val="6B6B6B"/>
-        </w:rPr>
-        <w:t xml:space="preserve">Voting model for constitutional amendments and lead elections — the working draft floats “weighted tracking for democratic processes in a meritocratic way”; needs a concrete rule.</w:t>
-      </w:r>
-    </w:p>
-    <w:p>
-      <w:pPr>
-        <w:spacing w:after="120"/>
-        <w:ind w:left="360"/>
-      </w:pPr>
-      <w:r>
-        <w:rPr>
-          <w:b/>
-          <w:bCs/>
-          <w:color w:val="DC003B"/>
         </w:rPr>
         <w:t xml:space="preserve">OPEN QUESTION: </w:t>
       </w:r>
@@ -2033,21 +2427,70 @@
         <w:rPr>
           <w:i/>
           <w:iCs/>
-          <w:color w:val="6B6B6B"/>
+        </w:rPr>
+        <w:t xml:space="preserve">Ratification mechanism to decide: leadership vote only, all-member vote, or leadership vote with advisor endorsement.</w:t>
+      </w:r>
+    </w:p>
+    <w:p>
+      <w:pPr>
+        <w:pBdr>
+          <w:left w:val="single" w:color="888888" w:sz="18" w:space="8"/>
+        </w:pBdr>
+        <w:spacing w:after="160" w:before="120"/>
+        <w:ind w:left="576"/>
+      </w:pPr>
+      <w:r>
+        <w:rPr>
+          <w:b/>
+          <w:bCs/>
+          <w:i/>
+          <w:iCs/>
+        </w:rPr>
+        <w:t xml:space="preserve">OPEN QUESTION: </w:t>
+      </w:r>
+      <w:r>
+        <w:rPr>
+          <w:i/>
+          <w:iCs/>
+        </w:rPr>
+        <w:t xml:space="preserve">Voting model for constitutional amendments and lead elections — the working draft floats "weighted tracking for democratic processes in a meritocratic way"; needs a concrete rule.</w:t>
+      </w:r>
+    </w:p>
+    <w:p>
+      <w:pPr>
+        <w:pBdr>
+          <w:left w:val="single" w:color="888888" w:sz="18" w:space="8"/>
+        </w:pBdr>
+        <w:spacing w:after="160" w:before="120"/>
+        <w:ind w:left="576"/>
+      </w:pPr>
+      <w:r>
+        <w:rPr>
+          <w:b/>
+          <w:bCs/>
+          <w:i/>
+          <w:iCs/>
+        </w:rPr>
+        <w:t xml:space="preserve">OPEN QUESTION: </w:t>
+      </w:r>
+      <w:r>
+        <w:rPr>
+          <w:i/>
+          <w:iCs/>
         </w:rPr>
         <w:t xml:space="preserve">Quorum and standing orders for formal meetings (the draft references adapting standing orders from other Monash association constitutions).</w:t>
       </w:r>
     </w:p>
     <w:p>
-      <w:r>
-        <w:br w:type="page"/>
-      </w:r>
-    </w:p>
-    <w:p>
       <w:pPr>
         <w:pStyle w:val="Heading1"/>
-      </w:pPr>
-      <w:r>
+        <w:spacing w:after="160" w:before="360"/>
+      </w:pPr>
+      <w:r>
+        <w:rPr>
+          <w:b/>
+          <w:bCs/>
+        </w:rPr>
         <w:t xml:space="preserve">Appendix A — History and Leadership Honour Roll</w:t>
       </w:r>
     </w:p>
@@ -2064,21 +2507,17 @@
         </w:tblBorders>
       </w:tblPr>
       <w:tblGrid>
-        <w:gridCol w:w="2000"/>
-        <w:gridCol w:w="3513"/>
-        <w:gridCol w:w="3513"/>
+        <w:gridCol w:w="1300"/>
+        <w:gridCol w:w="3000"/>
+        <w:gridCol w:w="4726"/>
       </w:tblGrid>
       <w:tr>
+        <w:trPr>
+          <w:tblHeader/>
+        </w:trPr>
         <w:tc>
           <w:tcPr>
-            <w:tcW w:type="dxa" w:w="2000"/>
-            <w:tcBorders>
-              <w:top w:val="single" w:color="CCCCCC" w:sz="1"/>
-              <w:left w:val="single" w:color="CCCCCC" w:sz="1"/>
-              <w:bottom w:val="single" w:color="CCCCCC" w:sz="1"/>
-              <w:right w:val="single" w:color="CCCCCC" w:sz="1"/>
-            </w:tcBorders>
-            <w:shd w:fill="F3D6DE" w:val="clear"/>
+            <w:tcW w:type="dxa" w:w="1300"/>
             <w:tcMar>
               <w:top w:type="dxa" w:w="80"/>
               <w:left w:type="dxa" w:w="120"/>
@@ -2091,8 +2530,6 @@
               <w:rPr>
                 <w:b/>
                 <w:bCs/>
-                <w:sz w:val="20"/>
-                <w:szCs w:val="20"/>
               </w:rPr>
               <w:t xml:space="preserve">Year</w:t>
             </w:r>
@@ -2100,14 +2537,7 @@
         </w:tc>
         <w:tc>
           <w:tcPr>
-            <w:tcW w:type="dxa" w:w="3513"/>
-            <w:tcBorders>
-              <w:top w:val="single" w:color="CCCCCC" w:sz="1"/>
-              <w:left w:val="single" w:color="CCCCCC" w:sz="1"/>
-              <w:bottom w:val="single" w:color="CCCCCC" w:sz="1"/>
-              <w:right w:val="single" w:color="CCCCCC" w:sz="1"/>
-            </w:tcBorders>
-            <w:shd w:fill="F3D6DE" w:val="clear"/>
+            <w:tcW w:type="dxa" w:w="3000"/>
             <w:tcMar>
               <w:top w:type="dxa" w:w="80"/>
               <w:left w:type="dxa" w:w="120"/>
@@ -2120,8 +2550,6 @@
               <w:rPr>
                 <w:b/>
                 <w:bCs/>
-                <w:sz w:val="20"/>
-                <w:szCs w:val="20"/>
               </w:rPr>
               <w:t xml:space="preserve">Leadership</w:t>
             </w:r>
@@ -2129,14 +2557,7 @@
         </w:tc>
         <w:tc>
           <w:tcPr>
-            <w:tcW w:type="dxa" w:w="3513"/>
-            <w:tcBorders>
-              <w:top w:val="single" w:color="CCCCCC" w:sz="1"/>
-              <w:left w:val="single" w:color="CCCCCC" w:sz="1"/>
-              <w:bottom w:val="single" w:color="CCCCCC" w:sz="1"/>
-              <w:right w:val="single" w:color="CCCCCC" w:sz="1"/>
-            </w:tcBorders>
-            <w:shd w:fill="F3D6DE" w:val="clear"/>
+            <w:tcW w:type="dxa" w:w="4726"/>
             <w:tcMar>
               <w:top w:type="dxa" w:w="80"/>
               <w:left w:type="dxa" w:w="120"/>
@@ -2149,8 +2570,6 @@
               <w:rPr>
                 <w:b/>
                 <w:bCs/>
-                <w:sz w:val="20"/>
-                <w:szCs w:val="20"/>
               </w:rPr>
               <w:t xml:space="preserve">Theme</w:t>
             </w:r>
@@ -2160,13 +2579,7 @@
       <w:tr>
         <w:tc>
           <w:tcPr>
-            <w:tcW w:type="dxa" w:w="2000"/>
-            <w:tcBorders>
-              <w:top w:val="single" w:color="CCCCCC" w:sz="1"/>
-              <w:left w:val="single" w:color="CCCCCC" w:sz="1"/>
-              <w:bottom w:val="single" w:color="CCCCCC" w:sz="1"/>
-              <w:right w:val="single" w:color="CCCCCC" w:sz="1"/>
-            </w:tcBorders>
+            <w:tcW w:type="dxa" w:w="1300"/>
             <w:tcMar>
               <w:top w:type="dxa" w:w="80"/>
               <w:left w:type="dxa" w:w="120"/>
@@ -2176,25 +2589,13 @@
           </w:tcPr>
           <w:p>
             <w:r>
-              <w:rPr>
-                <w:b w:val="false"/>
-                <w:bCs w:val="false"/>
-                <w:sz w:val="20"/>
-                <w:szCs w:val="20"/>
-              </w:rPr>
               <w:t xml:space="preserve">2022</w:t>
             </w:r>
           </w:p>
         </w:tc>
         <w:tc>
           <w:tcPr>
-            <w:tcW w:type="dxa" w:w="3513"/>
-            <w:tcBorders>
-              <w:top w:val="single" w:color="CCCCCC" w:sz="1"/>
-              <w:left w:val="single" w:color="CCCCCC" w:sz="1"/>
-              <w:bottom w:val="single" w:color="CCCCCC" w:sz="1"/>
-              <w:right w:val="single" w:color="CCCCCC" w:sz="1"/>
-            </w:tcBorders>
+            <w:tcW w:type="dxa" w:w="3000"/>
             <w:tcMar>
               <w:top w:type="dxa" w:w="80"/>
               <w:left w:type="dxa" w:w="120"/>
@@ -2204,25 +2605,13 @@
           </w:tcPr>
           <w:p>
             <w:r>
-              <w:rPr>
-                <w:b w:val="false"/>
-                <w:bCs w:val="false"/>
-                <w:sz w:val="20"/>
-                <w:szCs w:val="20"/>
-              </w:rPr>
               <w:t xml:space="preserve">METTA under eSolutions VARS</w:t>
             </w:r>
           </w:p>
         </w:tc>
         <w:tc>
           <w:tcPr>
-            <w:tcW w:type="dxa" w:w="3513"/>
-            <w:tcBorders>
-              <w:top w:val="single" w:color="CCCCCC" w:sz="1"/>
-              <w:left w:val="single" w:color="CCCCCC" w:sz="1"/>
-              <w:bottom w:val="single" w:color="CCCCCC" w:sz="1"/>
-              <w:right w:val="single" w:color="CCCCCC" w:sz="1"/>
-            </w:tcBorders>
+            <w:tcW w:type="dxa" w:w="4726"/>
             <w:tcMar>
               <w:top w:type="dxa" w:w="80"/>
               <w:left w:type="dxa" w:w="120"/>
@@ -2232,12 +2621,6 @@
           </w:tcPr>
           <w:p>
             <w:r>
-              <w:rPr>
-                <w:b w:val="false"/>
-                <w:bCs w:val="false"/>
-                <w:sz w:val="20"/>
-                <w:szCs w:val="20"/>
-              </w:rPr>
               <w:t xml:space="preserve">Origins: student-led consultancy co-designing proof-of-concepts for Monash’s digital ecosystem</w:t>
             </w:r>
           </w:p>
@@ -2246,13 +2629,7 @@
       <w:tr>
         <w:tc>
           <w:tcPr>
-            <w:tcW w:type="dxa" w:w="2000"/>
-            <w:tcBorders>
-              <w:top w:val="single" w:color="CCCCCC" w:sz="1"/>
-              <w:left w:val="single" w:color="CCCCCC" w:sz="1"/>
-              <w:bottom w:val="single" w:color="CCCCCC" w:sz="1"/>
-              <w:right w:val="single" w:color="CCCCCC" w:sz="1"/>
-            </w:tcBorders>
+            <w:tcW w:type="dxa" w:w="1300"/>
             <w:tcMar>
               <w:top w:type="dxa" w:w="80"/>
               <w:left w:type="dxa" w:w="120"/>
@@ -2262,25 +2639,13 @@
           </w:tcPr>
           <w:p>
             <w:r>
-              <w:rPr>
-                <w:b w:val="false"/>
-                <w:bCs w:val="false"/>
-                <w:sz w:val="20"/>
-                <w:szCs w:val="20"/>
-              </w:rPr>
               <w:t xml:space="preserve">2023</w:t>
             </w:r>
           </w:p>
         </w:tc>
         <w:tc>
           <w:tcPr>
-            <w:tcW w:type="dxa" w:w="3513"/>
-            <w:tcBorders>
-              <w:top w:val="single" w:color="CCCCCC" w:sz="1"/>
-              <w:left w:val="single" w:color="CCCCCC" w:sz="1"/>
-              <w:bottom w:val="single" w:color="CCCCCC" w:sz="1"/>
-              <w:right w:val="single" w:color="CCCCCC" w:sz="1"/>
-            </w:tcBorders>
+            <w:tcW w:type="dxa" w:w="3000"/>
             <w:tcMar>
               <w:top w:type="dxa" w:w="80"/>
               <w:left w:type="dxa" w:w="120"/>
@@ -2290,25 +2655,13 @@
           </w:tcPr>
           <w:p>
             <w:r>
-              <w:rPr>
-                <w:b w:val="false"/>
-                <w:bCs w:val="false"/>
-                <w:sz w:val="20"/>
-                <w:szCs w:val="20"/>
-              </w:rPr>
               <w:t xml:space="preserve">Co-Leads: Rohan Kalanje &amp; Jackie Ho</w:t>
             </w:r>
           </w:p>
         </w:tc>
         <w:tc>
           <w:tcPr>
-            <w:tcW w:type="dxa" w:w="3513"/>
-            <w:tcBorders>
-              <w:top w:val="single" w:color="CCCCCC" w:sz="1"/>
-              <w:left w:val="single" w:color="CCCCCC" w:sz="1"/>
-              <w:bottom w:val="single" w:color="CCCCCC" w:sz="1"/>
-              <w:right w:val="single" w:color="CCCCCC" w:sz="1"/>
-            </w:tcBorders>
+            <w:tcW w:type="dxa" w:w="4726"/>
             <w:tcMar>
               <w:top w:type="dxa" w:w="80"/>
               <w:left w:type="dxa" w:w="120"/>
@@ -2318,13 +2671,7 @@
           </w:tcPr>
           <w:p>
             <w:r>
-              <w:rPr>
-                <w:b w:val="false"/>
-                <w:bCs w:val="false"/>
-                <w:sz w:val="20"/>
-                <w:szCs w:val="20"/>
-              </w:rPr>
-              <w:t xml:space="preserve">“The year of small beginnings” — ~7 members</w:t>
+              <w:t xml:space="preserve">"The year of small beginnings" — ~7 members</w:t>
             </w:r>
           </w:p>
         </w:tc>
@@ -2332,13 +2679,7 @@
       <w:tr>
         <w:tc>
           <w:tcPr>
-            <w:tcW w:type="dxa" w:w="2000"/>
-            <w:tcBorders>
-              <w:top w:val="single" w:color="CCCCCC" w:sz="1"/>
-              <w:left w:val="single" w:color="CCCCCC" w:sz="1"/>
-              <w:bottom w:val="single" w:color="CCCCCC" w:sz="1"/>
-              <w:right w:val="single" w:color="CCCCCC" w:sz="1"/>
-            </w:tcBorders>
+            <w:tcW w:type="dxa" w:w="1300"/>
             <w:tcMar>
               <w:top w:type="dxa" w:w="80"/>
               <w:left w:type="dxa" w:w="120"/>
@@ -2348,25 +2689,13 @@
           </w:tcPr>
           <w:p>
             <w:r>
-              <w:rPr>
-                <w:b w:val="false"/>
-                <w:bCs w:val="false"/>
-                <w:sz w:val="20"/>
-                <w:szCs w:val="20"/>
-              </w:rPr>
               <w:t xml:space="preserve">2024</w:t>
             </w:r>
           </w:p>
         </w:tc>
         <w:tc>
           <w:tcPr>
-            <w:tcW w:type="dxa" w:w="3513"/>
-            <w:tcBorders>
-              <w:top w:val="single" w:color="CCCCCC" w:sz="1"/>
-              <w:left w:val="single" w:color="CCCCCC" w:sz="1"/>
-              <w:bottom w:val="single" w:color="CCCCCC" w:sz="1"/>
-              <w:right w:val="single" w:color="CCCCCC" w:sz="1"/>
-            </w:tcBorders>
+            <w:tcW w:type="dxa" w:w="3000"/>
             <w:tcMar>
               <w:top w:type="dxa" w:w="80"/>
               <w:left w:type="dxa" w:w="120"/>
@@ -2376,25 +2705,13 @@
           </w:tcPr>
           <w:p>
             <w:r>
-              <w:rPr>
-                <w:b w:val="false"/>
-                <w:bCs w:val="false"/>
-                <w:sz w:val="20"/>
-                <w:szCs w:val="20"/>
-              </w:rPr>
               <w:t xml:space="preserve">Lead: Rohan Kalanje</w:t>
             </w:r>
           </w:p>
         </w:tc>
         <w:tc>
           <w:tcPr>
-            <w:tcW w:type="dxa" w:w="3513"/>
-            <w:tcBorders>
-              <w:top w:val="single" w:color="CCCCCC" w:sz="1"/>
-              <w:left w:val="single" w:color="CCCCCC" w:sz="1"/>
-              <w:bottom w:val="single" w:color="CCCCCC" w:sz="1"/>
-              <w:right w:val="single" w:color="CCCCCC" w:sz="1"/>
-            </w:tcBorders>
+            <w:tcW w:type="dxa" w:w="4726"/>
             <w:tcMar>
               <w:top w:type="dxa" w:w="80"/>
               <w:left w:type="dxa" w:w="120"/>
@@ -2404,13 +2721,7 @@
           </w:tcPr>
           <w:p>
             <w:r>
-              <w:rPr>
-                <w:b w:val="false"/>
-                <w:bCs w:val="false"/>
-                <w:sz w:val="20"/>
-                <w:szCs w:val="20"/>
-              </w:rPr>
-              <w:t xml:space="preserve">“Rebirth and growth” — METTA→MNET rebrand (name approved by FIT on 4 July 2024 — naming day); 39 members; departments defined; Globes ships with Stanford/David Rumsey; SXSW, PAX, TGX</w:t>
+              <w:t xml:space="preserve">"Rebirth and growth" — METTA→MNET rebrand (name approved by FIT on 4 July 2024 — naming day); 39 members; departments defined; Globes ships with Stanford/David Rumsey; SXSW, PAX, TGX</w:t>
             </w:r>
           </w:p>
         </w:tc>
@@ -2418,13 +2729,7 @@
       <w:tr>
         <w:tc>
           <w:tcPr>
-            <w:tcW w:type="dxa" w:w="2000"/>
-            <w:tcBorders>
-              <w:top w:val="single" w:color="CCCCCC" w:sz="1"/>
-              <w:left w:val="single" w:color="CCCCCC" w:sz="1"/>
-              <w:bottom w:val="single" w:color="CCCCCC" w:sz="1"/>
-              <w:right w:val="single" w:color="CCCCCC" w:sz="1"/>
-            </w:tcBorders>
+            <w:tcW w:type="dxa" w:w="1300"/>
             <w:tcMar>
               <w:top w:type="dxa" w:w="80"/>
               <w:left w:type="dxa" w:w="120"/>
@@ -2434,25 +2739,13 @@
           </w:tcPr>
           <w:p>
             <w:r>
-              <w:rPr>
-                <w:b w:val="false"/>
-                <w:bCs w:val="false"/>
-                <w:sz w:val="20"/>
-                <w:szCs w:val="20"/>
-              </w:rPr>
               <w:t xml:space="preserve">2025</w:t>
             </w:r>
           </w:p>
         </w:tc>
         <w:tc>
           <w:tcPr>
-            <w:tcW w:type="dxa" w:w="3513"/>
-            <w:tcBorders>
-              <w:top w:val="single" w:color="CCCCCC" w:sz="1"/>
-              <w:left w:val="single" w:color="CCCCCC" w:sz="1"/>
-              <w:bottom w:val="single" w:color="CCCCCC" w:sz="1"/>
-              <w:right w:val="single" w:color="CCCCCC" w:sz="1"/>
-            </w:tcBorders>
+            <w:tcW w:type="dxa" w:w="3000"/>
             <w:tcMar>
               <w:top w:type="dxa" w:w="80"/>
               <w:left w:type="dxa" w:w="120"/>
@@ -2462,25 +2755,13 @@
           </w:tcPr>
           <w:p>
             <w:r>
-              <w:rPr>
-                <w:b w:val="false"/>
-                <w:bCs w:val="false"/>
-                <w:sz w:val="20"/>
-                <w:szCs w:val="20"/>
-              </w:rPr>
-              <w:t xml:space="preserve">Rohan Kalanje (S1); Co-Leads Luke Downward &amp; Isabelle “Sabi” Fernan (S2)</w:t>
+              <w:t xml:space="preserve">Rohan Kalanje (S1); Co-Leads Luke Downward &amp; Isabelle "Sabi" Fernan (S2)</w:t>
             </w:r>
           </w:p>
         </w:tc>
         <w:tc>
           <w:tcPr>
-            <w:tcW w:type="dxa" w:w="3513"/>
-            <w:tcBorders>
-              <w:top w:val="single" w:color="CCCCCC" w:sz="1"/>
-              <w:left w:val="single" w:color="CCCCCC" w:sz="1"/>
-              <w:bottom w:val="single" w:color="CCCCCC" w:sz="1"/>
-              <w:right w:val="single" w:color="CCCCCC" w:sz="1"/>
-            </w:tcBorders>
+            <w:tcW w:type="dxa" w:w="4726"/>
             <w:tcMar>
               <w:top w:type="dxa" w:w="80"/>
               <w:left w:type="dxa" w:w="120"/>
@@ -2490,13 +2771,7 @@
           </w:tcPr>
           <w:p>
             <w:r>
-              <w:rPr>
-                <w:b w:val="false"/>
-                <w:bCs w:val="false"/>
-                <w:sz w:val="20"/>
-                <w:szCs w:val="20"/>
-              </w:rPr>
-              <w:t xml:space="preserve">“Growth, continuation, and structure for longevity” — first handover (15 July 2025, the founder steps down); 74 new members; Mepo the mascot &amp; merch; Tech Futures Night; website redesign begins</w:t>
+              <w:t xml:space="preserve">"Growth, continuation, and structure for longevity" — first handover (15 July 2025, the founder steps down); 74 new members; Mepo the mascot &amp; merch; Tech Futures Night; website redesign begins</w:t>
             </w:r>
           </w:p>
         </w:tc>
@@ -2504,13 +2779,7 @@
       <w:tr>
         <w:tc>
           <w:tcPr>
-            <w:tcW w:type="dxa" w:w="2000"/>
-            <w:tcBorders>
-              <w:top w:val="single" w:color="CCCCCC" w:sz="1"/>
-              <w:left w:val="single" w:color="CCCCCC" w:sz="1"/>
-              <w:bottom w:val="single" w:color="CCCCCC" w:sz="1"/>
-              <w:right w:val="single" w:color="CCCCCC" w:sz="1"/>
-            </w:tcBorders>
+            <w:tcW w:type="dxa" w:w="1300"/>
             <w:tcMar>
               <w:top w:type="dxa" w:w="80"/>
               <w:left w:type="dxa" w:w="120"/>
@@ -2520,25 +2789,13 @@
           </w:tcPr>
           <w:p>
             <w:r>
-              <w:rPr>
-                <w:b w:val="false"/>
-                <w:bCs w:val="false"/>
-                <w:sz w:val="20"/>
-                <w:szCs w:val="20"/>
-              </w:rPr>
               <w:t xml:space="preserve">2026</w:t>
             </w:r>
           </w:p>
         </w:tc>
         <w:tc>
           <w:tcPr>
-            <w:tcW w:type="dxa" w:w="3513"/>
-            <w:tcBorders>
-              <w:top w:val="single" w:color="CCCCCC" w:sz="1"/>
-              <w:left w:val="single" w:color="CCCCCC" w:sz="1"/>
-              <w:bottom w:val="single" w:color="CCCCCC" w:sz="1"/>
-              <w:right w:val="single" w:color="CCCCCC" w:sz="1"/>
-            </w:tcBorders>
+            <w:tcW w:type="dxa" w:w="3000"/>
             <w:tcMar>
               <w:top w:type="dxa" w:w="80"/>
               <w:left w:type="dxa" w:w="120"/>
@@ -2548,25 +2805,13 @@
           </w:tcPr>
           <w:p>
             <w:r>
-              <w:rPr>
-                <w:b w:val="false"/>
-                <w:bCs w:val="false"/>
-                <w:sz w:val="20"/>
-                <w:szCs w:val="20"/>
-              </w:rPr>
               <w:t xml:space="preserve">Co-Leads: Nicole Ellis &amp; Eunice Yap</w:t>
             </w:r>
           </w:p>
         </w:tc>
         <w:tc>
           <w:tcPr>
-            <w:tcW w:type="dxa" w:w="3513"/>
-            <w:tcBorders>
-              <w:top w:val="single" w:color="CCCCCC" w:sz="1"/>
-              <w:left w:val="single" w:color="CCCCCC" w:sz="1"/>
-              <w:bottom w:val="single" w:color="CCCCCC" w:sz="1"/>
-              <w:right w:val="single" w:color="CCCCCC" w:sz="1"/>
-            </w:tcBorders>
+            <w:tcW w:type="dxa" w:w="4726"/>
             <w:tcMar>
               <w:top w:type="dxa" w:w="80"/>
               <w:left w:type="dxa" w:w="120"/>
@@ -2576,12 +2821,6 @@
           </w:tcPr>
           <w:p>
             <w:r>
-              <w:rPr>
-                <w:b w:val="false"/>
-                <w:bCs w:val="false"/>
-                <w:sz w:val="20"/>
-                <w:szCs w:val="20"/>
-              </w:rPr>
               <w:t xml:space="preserve">Consolidation — ~5 quality portfolios, cross-department collaboration, education→outreach</w:t>
             </w:r>
           </w:p>
@@ -2604,18 +2843,20 @@
         <w:rPr>
           <w:i/>
           <w:iCs/>
-          <w:color w:val="6B6B6B"/>
-          <w:sz w:val="20"/>
-          <w:szCs w:val="20"/>
-        </w:rPr>
-        <w:t xml:space="preserve">Detailed year-by-year accomplishments (projects, events, workshops, competitions) are maintained in the Team Lead Handover document’s “MNET History and Leadership Accomplishments” section and summarised in the website repository’s docs/MNET.md.</w:t>
+        </w:rPr>
+        <w:t xml:space="preserve">Detailed year-by-year accomplishments (projects, events, workshops, competitions) are maintained in the Team Lead Handover document’s "MNET History and Leadership Accomplishments" section and summarised in the website repository’s docs/MNET.md.</w:t>
       </w:r>
     </w:p>
     <w:p>
       <w:pPr>
         <w:pStyle w:val="Heading1"/>
-      </w:pPr>
-      <w:r>
+        <w:spacing w:after="160" w:before="360"/>
+      </w:pPr>
+      <w:r>
+        <w:rPr>
+          <w:b/>
+          <w:bCs/>
+        </w:rPr>
         <w:t xml:space="preserve">Revision History</w:t>
       </w:r>
     </w:p>
@@ -2629,20 +2870,33 @@
         <w:spacing w:after="60"/>
       </w:pPr>
       <w:r>
-        <w:t xml:space="preserve">v0.3 — 10 July 2026 — Recorded the mascot’s name and naming date (Mepo the platypus, named 15 July 2025 as founder Rohan Kalanje stepped down; M-E-P-O honours Marketing, Education, Projects, Operations), resolving the Article 1 open question. Reframed the team’s scope around the simulation-technologies umbrella, with “emerging” read as digital-to-physical (tagline: “Enter the Digital Frontier”). Trimmed Article 6 recruitment detail pending re-documentation of the process and noted the Games and Immersive Media (GIM) talent pipeline. Added Human-Centred Computing (HCC) department context to Article 9.</w:t>
-      </w:r>
-    </w:p>
-    <w:p>
-      <w:pPr>
-        <w:pStyle w:val="ListParagraph"/>
-        <w:numPr>
-          <w:ilvl w:val="0"/>
-          <w:numId w:val="3"/>
-        </w:numPr>
-        <w:spacing w:after="60"/>
-      </w:pPr>
-      <w:r>
-        <w:t xml:space="preserve">v0.2 — 10 July 2026 — Rebuilt from the team’s working DRAFT MNET Constitution plus the Team Lead Handover [2023–5], MNET General Handover, Operations Handover, 2026 Vision Handover, 2026 MOUs, and the 2025 Prospectus. Added the official naming-day record (4 July 2024, verified against the METTA Official Name Change Request email thread with A/Prof Michael Wybrow) and the meeting taxonomy from the Notion New Meeting Structure page and 2024 All Hands minutes. Remaining open questions consolidated under Article 13.</w:t>
+        <w:t xml:space="preserve">v0.4 — 10 July 2026 — Merged the two parallel 10-July drafts. Base: v0.3 (this lineage). Merged in from the parallel working draft (repo file MNET-Constitution-DRAFT-v0.2.docx): Article 13 (Governance within the University — Monash Student Teams Procedure Ver 2, MSTI reporting and funding cycle, Impact 2030 reviews, December 2025 restructure, ITTA/forum coordination); Procedure overlays on recruitment (annual reapplication, probation, documentation), leadership selection (advisor endorsement, gender-balanced staff panels), onboarding (training within three months) and misconduct escalation; §6.5 CPD hours (420/year) and the ENG4802 course-credit pathway; the MNET Schedule calendar norms (§4.5); funding figures and Reftab (§11.2–11.3); Tech Futures in recurring events; and the 2025 EOY stakeholder record (§10.6). Amendments renumbered to Article 14.</w:t>
+      </w:r>
+    </w:p>
+    <w:p>
+      <w:pPr>
+        <w:pStyle w:val="ListParagraph"/>
+        <w:numPr>
+          <w:ilvl w:val="0"/>
+          <w:numId w:val="3"/>
+        </w:numPr>
+        <w:spacing w:after="60"/>
+      </w:pPr>
+      <w:r>
+        <w:t xml:space="preserve">v0.3 — 10 July 2026 — Recorded the mascot’s name and naming date (Mepo the platypus, named 15 July 2025 as founder Rohan Kalanje stepped down; M-E-P-O honours Marketing, Education, Projects, Operations), resolving the Article 1 open question. Reframed the team’s scope around the simulation-technologies umbrella, with "emerging" read as digital-to-physical (tagline: "Enter the Digital Frontier"). Trimmed Article 6 recruitment detail pending re-documentation of the process and noted the Games and Immersive Media (GIM) talent pipeline. Added Human-Centred Computing (HCC) department context to Article 9.</w:t>
+      </w:r>
+    </w:p>
+    <w:p>
+      <w:pPr>
+        <w:pStyle w:val="ListParagraph"/>
+        <w:numPr>
+          <w:ilvl w:val="0"/>
+          <w:numId w:val="3"/>
+        </w:numPr>
+        <w:spacing w:after="60"/>
+      </w:pPr>
+      <w:r>
+        <w:t xml:space="preserve">v0.2 — 10 July 2026 — Rebuilt from the team’s working DRAFT MNET Constitution plus the Team Lead Handover [2023–5], MNET General Handover, Operations Handover, 2026 Vision Handover, 2026 MOUs, and the 2025 Prospectus. Added the official naming-day record (4 July 2024, verified against the METTA Official Name Change Request email thread with A/Prof Michael Wybrow) and the meeting taxonomy from the Notion New Meeting Structure page and 2024 All Hands minutes. Remaining open questions consolidated under Article 13 (now Article 14). A parallel v0.2 of the same date (different lineage) contributed the Student Teams Procedure and ecosystem material merged in v0.4.</w:t>
       </w:r>
     </w:p>
     <w:p>
@@ -2659,8 +2913,6 @@
       </w:r>
     </w:p>
     <w:sectPr>
-      <w:headerReference w:type="default" r:id="rId7"/>
-      <w:footerReference w:type="default" r:id="rId8"/>
       <w:pgSz w:w="11906" w:h="16838" w:orient="portrait"/>
       <w:pgMar w:top="1440" w:right="1440" w:bottom="1440" w:left="1440" w:header="708" w:footer="708" w:gutter="0"/>
       <w:pgNumType/>
@@ -2711,35 +2963,6 @@
 </w:endnotes>
 </file>
 
-<file path=word/footer1.xml><?xml version="1.0" encoding="utf-8"?>
-<w:ftr xmlns:wpc="http://schemas.microsoft.com/office/word/2010/wordprocessingCanvas" xmlns:mc="http://schemas.openxmlformats.org/markup-compatibility/2006" xmlns:o="urn:schemas-microsoft-com:office:office" xmlns:r="http://schemas.openxmlformats.org/officeDocument/2006/relationships" xmlns:m="http://schemas.openxmlformats.org/officeDocument/2006/math" xmlns:v="urn:schemas-microsoft-com:vml" xmlns:wp14="http://schemas.microsoft.com/office/word/2010/wordprocessingDrawing" xmlns:wp="http://schemas.openxmlformats.org/drawingml/2006/wordprocessingDrawing" xmlns:w10="urn:schemas-microsoft-com:office:word" xmlns:w="http://schemas.openxmlformats.org/wordprocessingml/2006/main" xmlns:w14="http://schemas.microsoft.com/office/word/2010/wordml" xmlns:w15="http://schemas.microsoft.com/office/word/2012/wordml" xmlns:wpg="http://schemas.microsoft.com/office/word/2010/wordprocessingGroup" xmlns:wpi="http://schemas.microsoft.com/office/word/2010/wordprocessingInk" xmlns:wne="http://schemas.microsoft.com/office/word/2006/wordml" xmlns:wps="http://schemas.microsoft.com/office/word/2010/wordprocessingShape">
-  <w:p>
-    <w:pPr>
-      <w:jc w:val="center"/>
-    </w:pPr>
-    <w:r>
-      <w:rPr>
-        <w:color w:val="6B6B6B"/>
-        <w:sz w:val="18"/>
-        <w:szCs w:val="18"/>
-      </w:rPr>
-      <w:t xml:space="preserve">Monash Nexus for Emerging Technologies — Page </w:t>
-    </w:r>
-    <w:r>
-      <w:rPr>
-        <w:color w:val="6B6B6B"/>
-        <w:sz w:val="18"/>
-        <w:szCs w:val="18"/>
-      </w:rPr>
-      <w:fldChar w:fldCharType="begin"/>
-      <w:instrText xml:space="preserve">PAGE</w:instrText>
-      <w:fldChar w:fldCharType="separate"/>
-      <w:fldChar w:fldCharType="end"/>
-    </w:r>
-  </w:p>
-</w:ftr>
-</file>
-
 <file path=word/footnotes.xml><?xml version="1.0" encoding="utf-8"?>
 <w:footnotes xmlns:wpc="http://schemas.microsoft.com/office/word/2010/wordprocessingCanvas" xmlns:mc="http://schemas.openxmlformats.org/markup-compatibility/2006" xmlns:o="urn:schemas-microsoft-com:office:office" xmlns:r="http://schemas.openxmlformats.org/officeDocument/2006/relationships" xmlns:m="http://schemas.openxmlformats.org/officeDocument/2006/math" xmlns:v="urn:schemas-microsoft-com:vml" xmlns:wp14="http://schemas.microsoft.com/office/word/2010/wordprocessingDrawing" xmlns:wp="http://schemas.openxmlformats.org/drawingml/2006/wordprocessingDrawing" xmlns:w10="urn:schemas-microsoft-com:office:word" xmlns:w="http://schemas.openxmlformats.org/wordprocessingml/2006/main" xmlns:w14="http://schemas.microsoft.com/office/word/2010/wordml" xmlns:w15="http://schemas.microsoft.com/office/word/2012/wordml" xmlns:wpg="http://schemas.microsoft.com/office/word/2010/wordprocessingGroup" xmlns:wpi="http://schemas.microsoft.com/office/word/2010/wordprocessingInk" xmlns:wne="http://schemas.microsoft.com/office/word/2006/wordml" xmlns:wps="http://schemas.microsoft.com/office/word/2010/wordprocessingShape" mc:Ignorable="w14 w15 wp14">
   <w:footnote w:type="separator" w:id="-1">
@@ -2775,26 +2998,6 @@
     </w:p>
   </w:footnote>
 </w:footnotes>
-</file>
-
-<file path=word/header1.xml><?xml version="1.0" encoding="utf-8"?>
-<w:hdr xmlns:wpc="http://schemas.microsoft.com/office/word/2010/wordprocessingCanvas" xmlns:mc="http://schemas.openxmlformats.org/markup-compatibility/2006" xmlns:o="urn:schemas-microsoft-com:office:office" xmlns:r="http://schemas.openxmlformats.org/officeDocument/2006/relationships" xmlns:m="http://schemas.openxmlformats.org/officeDocument/2006/math" xmlns:v="urn:schemas-microsoft-com:vml" xmlns:wp14="http://schemas.microsoft.com/office/word/2010/wordprocessingDrawing" xmlns:wp="http://schemas.openxmlformats.org/drawingml/2006/wordprocessingDrawing" xmlns:w10="urn:schemas-microsoft-com:office:word" xmlns:w="http://schemas.openxmlformats.org/wordprocessingml/2006/main" xmlns:w14="http://schemas.microsoft.com/office/word/2010/wordml" xmlns:w15="http://schemas.microsoft.com/office/word/2012/wordml" xmlns:wpg="http://schemas.microsoft.com/office/word/2010/wordprocessingGroup" xmlns:wpi="http://schemas.microsoft.com/office/word/2010/wordprocessingInk" xmlns:wne="http://schemas.microsoft.com/office/word/2006/wordml" xmlns:wps="http://schemas.microsoft.com/office/word/2010/wordprocessingShape" xmlns:cx="http://schemas.microsoft.com/office/drawing/2014/chartex" xmlns:cx1="http://schemas.microsoft.com/office/drawing/2015/9/8/chartex" xmlns:cx2="http://schemas.microsoft.com/office/drawing/2015/10/21/chartex" xmlns:cx3="http://schemas.microsoft.com/office/drawing/2016/5/9/chartex" xmlns:cx4="http://schemas.microsoft.com/office/drawing/2016/5/10/chartex" xmlns:cx5="http://schemas.microsoft.com/office/drawing/2016/5/11/chartex" xmlns:cx6="http://schemas.microsoft.com/office/drawing/2016/5/12/chartex" xmlns:cx7="http://schemas.microsoft.com/office/drawing/2016/5/13/chartex" xmlns:cx8="http://schemas.microsoft.com/office/drawing/2016/5/14/chartex" xmlns:w16cid="http://schemas.microsoft.com/office/word/2016/wordml/cid" xmlns:w16se="http://schemas.microsoft.com/office/word/2015/wordml/symex">
-  <w:p>
-    <w:pPr>
-      <w:jc w:val="right"/>
-    </w:pPr>
-    <w:r>
-      <w:rPr>
-        <w:b/>
-        <w:bCs/>
-        <w:color w:val="DC003B"/>
-        <w:sz w:val="18"/>
-        <w:szCs w:val="18"/>
-      </w:rPr>
-      <w:t xml:space="preserve">MNET Constitution — DRAFT v0.3 — NOT RATIFIED</w:t>
-    </w:r>
-  </w:p>
-</w:hdr>
 </file>
 
 <file path=word/numbering.xml><?xml version="1.0" encoding="utf-8"?>
@@ -2889,7 +3092,7 @@
       <w:start w:val="1"/>
       <w:numFmt w:val="bullet"/>
       <w:lvlText w:val="•"/>
-      <w:lvlJc w:val="left"/>
+      <w:lvlJc w:val="start"/>
       <w:pPr>
         <w:ind w:left="720" w:hanging="360"/>
       </w:pPr>
@@ -2898,9 +3101,9 @@
       <w:start w:val="1"/>
       <w:numFmt w:val="bullet"/>
       <w:lvlText w:val="◦"/>
-      <w:lvlJc w:val="left"/>
-      <w:pPr>
-        <w:ind w:left="1200" w:hanging="360"/>
+      <w:lvlJc w:val="start"/>
+      <w:pPr>
+        <w:ind w:left="1224" w:hanging="360"/>
       </w:pPr>
     </w:lvl>
   </w:abstractNum>
@@ -2910,7 +3113,7 @@
       <w:start w:val="1"/>
       <w:numFmt w:val="decimal"/>
       <w:lvlText w:val="%1."/>
-      <w:lvlJc w:val="left"/>
+      <w:lvlJc w:val="start"/>
       <w:pPr>
         <w:ind w:left="720" w:hanging="360"/>
       </w:pPr>
@@ -2922,7 +3125,7 @@
       <w:start w:val="1"/>
       <w:numFmt w:val="decimal"/>
       <w:lvlText w:val="%1."/>
-      <w:lvlJc w:val="left"/>
+      <w:lvlJc w:val="start"/>
       <w:pPr>
         <w:ind w:left="720" w:hanging="360"/>
       </w:pPr>
@@ -2934,7 +3137,7 @@
       <w:start w:val="1"/>
       <w:numFmt w:val="decimal"/>
       <w:lvlText w:val="%1."/>
-      <w:lvlJc w:val="left"/>
+      <w:lvlJc w:val="start"/>
       <w:pPr>
         <w:ind w:left="720" w:hanging="360"/>
       </w:pPr>
@@ -2946,7 +3149,7 @@
       <w:start w:val="1"/>
       <w:numFmt w:val="decimal"/>
       <w:lvlText w:val="%1."/>
-      <w:lvlJc w:val="left"/>
+      <w:lvlJc w:val="start"/>
       <w:pPr>
         <w:ind w:left="720" w:hanging="360"/>
       </w:pPr>
@@ -2958,7 +3161,7 @@
       <w:start w:val="1"/>
       <w:numFmt w:val="decimal"/>
       <w:lvlText w:val="%1."/>
-      <w:lvlJc w:val="left"/>
+      <w:lvlJc w:val="start"/>
       <w:pPr>
         <w:ind w:left="720" w:hanging="360"/>
       </w:pPr>
@@ -2970,7 +3173,7 @@
       <w:start w:val="1"/>
       <w:numFmt w:val="decimal"/>
       <w:lvlText w:val="%1."/>
-      <w:lvlJc w:val="left"/>
+      <w:lvlJc w:val="start"/>
       <w:pPr>
         <w:ind w:left="720" w:hanging="360"/>
       </w:pPr>
@@ -2982,7 +3185,7 @@
       <w:start w:val="1"/>
       <w:numFmt w:val="decimal"/>
       <w:lvlText w:val="%1."/>
-      <w:lvlJc w:val="left"/>
+      <w:lvlJc w:val="start"/>
       <w:pPr>
         <w:ind w:left="720" w:hanging="360"/>
       </w:pPr>
@@ -2994,7 +3197,7 @@
       <w:start w:val="1"/>
       <w:numFmt w:val="decimal"/>
       <w:lvlText w:val="%1."/>
-      <w:lvlJc w:val="left"/>
+      <w:lvlJc w:val="start"/>
       <w:pPr>
         <w:ind w:left="720" w:hanging="360"/>
       </w:pPr>
@@ -3006,7 +3209,7 @@
       <w:start w:val="1"/>
       <w:numFmt w:val="decimal"/>
       <w:lvlText w:val="%1."/>
-      <w:lvlJc w:val="left"/>
+      <w:lvlJc w:val="start"/>
       <w:pPr>
         <w:ind w:left="720" w:hanging="360"/>
       </w:pPr>
@@ -3018,31 +3221,7 @@
       <w:start w:val="1"/>
       <w:numFmt w:val="decimal"/>
       <w:lvlText w:val="%1."/>
-      <w:lvlJc w:val="left"/>
-      <w:pPr>
-        <w:ind w:left="720" w:hanging="360"/>
-      </w:pPr>
-    </w:lvl>
-  </w:abstractNum>
-  <w:abstractNum w:abstractNumId="13" w15:restartNumberingAfterBreak="0">
-    <w:multiLevelType w:val="hybridMultilevel"/>
-    <w:lvl w:ilvl="0" w15:tentative="1">
-      <w:start w:val="1"/>
-      <w:numFmt w:val="decimal"/>
-      <w:lvlText w:val="%1."/>
-      <w:lvlJc w:val="left"/>
-      <w:pPr>
-        <w:ind w:left="720" w:hanging="360"/>
-      </w:pPr>
-    </w:lvl>
-  </w:abstractNum>
-  <w:abstractNum w:abstractNumId="14" w15:restartNumberingAfterBreak="0">
-    <w:multiLevelType w:val="hybridMultilevel"/>
-    <w:lvl w:ilvl="0" w15:tentative="1">
-      <w:start w:val="1"/>
-      <w:numFmt w:val="decimal"/>
-      <w:lvlText w:val="%1."/>
-      <w:lvlJc w:val="left"/>
+      <w:lvlJc w:val="start"/>
       <w:pPr>
         <w:ind w:left="720" w:hanging="360"/>
       </w:pPr>
@@ -3067,37 +3246,55 @@
     </w:lvlOverride>
   </w:num>
   <w:num w:numId="4">
+    <w:abstractNumId w:val="4"/>
+    <w:lvlOverride w:ilvl="0">
+      <w:startOverride w:val="1"/>
+    </w:lvlOverride>
+  </w:num>
+  <w:num w:numId="5">
+    <w:abstractNumId w:val="5"/>
+    <w:lvlOverride w:ilvl="0">
+      <w:startOverride w:val="1"/>
+    </w:lvlOverride>
+  </w:num>
+  <w:num w:numId="6">
+    <w:abstractNumId w:val="6"/>
+    <w:lvlOverride w:ilvl="0">
+      <w:startOverride w:val="1"/>
+    </w:lvlOverride>
+  </w:num>
+  <w:num w:numId="7">
+    <w:abstractNumId w:val="7"/>
+    <w:lvlOverride w:ilvl="0">
+      <w:startOverride w:val="1"/>
+    </w:lvlOverride>
+  </w:num>
+  <w:num w:numId="8">
     <w:abstractNumId w:val="8"/>
     <w:lvlOverride w:ilvl="0">
       <w:startOverride w:val="1"/>
     </w:lvlOverride>
   </w:num>
-  <w:num w:numId="5">
+  <w:num w:numId="9">
     <w:abstractNumId w:val="9"/>
     <w:lvlOverride w:ilvl="0">
       <w:startOverride w:val="1"/>
     </w:lvlOverride>
   </w:num>
-  <w:num w:numId="6">
+  <w:num w:numId="10">
     <w:abstractNumId w:val="10"/>
     <w:lvlOverride w:ilvl="0">
       <w:startOverride w:val="1"/>
     </w:lvlOverride>
   </w:num>
-  <w:num w:numId="7">
+  <w:num w:numId="11">
     <w:abstractNumId w:val="11"/>
     <w:lvlOverride w:ilvl="0">
       <w:startOverride w:val="1"/>
     </w:lvlOverride>
   </w:num>
-  <w:num w:numId="8">
+  <w:num w:numId="12">
     <w:abstractNumId w:val="12"/>
-    <w:lvlOverride w:ilvl="0">
-      <w:startOverride w:val="1"/>
-    </w:lvlOverride>
-  </w:num>
-  <w:num w:numId="9">
-    <w:abstractNumId w:val="13"/>
     <w:lvlOverride w:ilvl="0">
       <w:startOverride w:val="1"/>
     </w:lvlOverride>
@@ -3133,9 +3330,12 @@
     <w:next w:val="Normal"/>
     <w:qFormat/>
     <w:rPr>
-      <w:color w:val="2E74B5"/>
-      <w:sz w:val="32"/>
-      <w:szCs w:val="32"/>
+      <w:rFonts w:ascii="Arial" w:cs="Arial" w:eastAsia="Arial" w:hAnsi="Arial"/>
+      <w:b/>
+      <w:bCs/>
+      <w:color w:val="000000"/>
+      <w:sz w:val="30"/>
+      <w:szCs w:val="30"/>
     </w:rPr>
   </w:style>
   <w:style w:type="paragraph" w:styleId="Heading2">
@@ -3144,9 +3344,12 @@
     <w:next w:val="Normal"/>
     <w:qFormat/>
     <w:rPr>
-      <w:color w:val="2E74B5"/>
-      <w:sz w:val="26"/>
-      <w:szCs w:val="26"/>
+      <w:rFonts w:ascii="Arial" w:cs="Arial" w:eastAsia="Arial" w:hAnsi="Arial"/>
+      <w:b/>
+      <w:bCs/>
+      <w:color w:val="000000"/>
+      <w:sz w:val="25"/>
+      <w:szCs w:val="25"/>
     </w:rPr>
   </w:style>
   <w:style w:type="paragraph" w:styleId="Heading3">
@@ -3288,39 +3491,5 @@
       <w:szCs w:val="20"/>
     </w:rPr>
   </w:style>
-  <w:style w:type="paragraph" w:styleId="Heading1">
-    <w:name w:val="Heading 1"/>
-    <w:basedOn w:val="Normal"/>
-    <w:next w:val="Normal"/>
-    <w:qFormat/>
-    <w:pPr>
-      <w:spacing w:after="200" w:before="320"/>
-      <w:outlineLvl w:val="0"/>
-    </w:pPr>
-    <w:rPr>
-      <w:rFonts w:ascii="Arial" w:cs="Arial" w:eastAsia="Arial" w:hAnsi="Arial"/>
-      <w:b/>
-      <w:bCs/>
-      <w:sz w:val="30"/>
-      <w:szCs w:val="30"/>
-    </w:rPr>
-  </w:style>
-  <w:style w:type="paragraph" w:styleId="Heading2">
-    <w:name w:val="Heading 2"/>
-    <w:basedOn w:val="Normal"/>
-    <w:next w:val="Normal"/>
-    <w:qFormat/>
-    <w:pPr>
-      <w:spacing w:after="140" w:before="220"/>
-      <w:outlineLvl w:val="1"/>
-    </w:pPr>
-    <w:rPr>
-      <w:rFonts w:ascii="Arial" w:cs="Arial" w:eastAsia="Arial" w:hAnsi="Arial"/>
-      <w:b/>
-      <w:bCs/>
-      <w:sz w:val="25"/>
-      <w:szCs w:val="25"/>
-    </w:rPr>
-  </w:style>
 </w:styles>
 </file>
</xml_diff>